<commit_message>
docs: update progress report, gantt chart, and add Pugh chart
Co-Authored-By: Claude Opus 4.6 (1M context) <noreply@anthropic.com>
</commit_message>
<xml_diff>
--- a/report/SENTINEL_Progress_Report.docx
+++ b/report/SENTINEL_Progress_Report.docx
@@ -2174,7 +2174,7 @@
           <w:sz w:val="22"/>
           <w:szCs w:val="22"/>
         </w:rPr>
-        <w:t xml:space="preserve">The antenna subsystem consists of a 12-element Yagi-Uda directional antenna (12 dBi gain, approximately 35° 3 dB beamwidth) mounted on a servo-driven pan mechanism for 360° azimuth rotation, and a fixed vertical dipole omnidirectional antenna (2 dBi gain) for all-around presence detection. Both antennas operate at 2.4 GHz. The Yagi is currently a PCB Yagi (ASIN B0BWM9X2HJ) for testing, with a planned upgrade to the L-com HG2415Y-RSP (15 dBi, 30° beamwidth) for the final system.</w:t>
+        <w:t xml:space="preserve">The antenna subsystem consists of a 12-element Yagi-Uda directional antenna (12 dBi gain, approximately 35° 3 dB beamwidth) mounted on the SPS-500 two-axis precision positioning system (provided by Honeywell) for 360° continuous azimuth rotation and −15° to +90° elevation, and a fixed vertical dipole omnidirectional antenna (2 dBi gain) for all-around presence detection. Both antennas operate at 2.4 GHz. The Yagi is currently a PCB Yagi (ASIN B0BWM9X2HJ) for testing, with a planned upgrade to the L-com HG2415Y-RSP (15 dBi, 30° beamwidth) for the final system. The SPS-500 communicates with the host computer via RS-422 serial protocol, providing 0.01° angular resolution and real-time encoder position feedback (see Section 4.2 for details).</w:t>
       </w:r>
     </w:p>
     <w:p>
@@ -3324,7 +3324,7 @@
       <w:r>
         <w:drawing>
           <wp:inline distT="0" distB="0" distL="0" distR="0">
-            <wp:extent cx="4953000" cy="2447925"/>
+            <wp:extent cx="4495800" cy="4953000"/>
             <wp:effectExtent t="0" r="0" b="0" l="0"/>
             <wp:docPr id="1" name="fig5_concept_selection.png" descr="fig5_concept_selection.png" title="fig5_concept_selection.png"/>
             <wp:cNvGraphicFramePr>
@@ -3349,7 +3349,7 @@
                   <pic:spPr bwMode="auto">
                     <a:xfrm>
                       <a:off x="0" y="0"/>
-                      <a:ext cx="4953000" cy="2447925"/>
+                      <a:ext cx="4495800" cy="4953000"/>
                     </a:xfrm>
                     <a:prstGeom prst="rect">
                       <a:avLst/>
@@ -3375,7 +3375,7 @@
           <w:sz w:val="20"/>
           <w:szCs w:val="20"/>
         </w:rPr>
-        <w:t xml:space="preserve">Figure 5: Concept selection summary. The dual-antenna mechanically steered architecture was chosen for optimal performance within project constraints.</w:t>
+        <w:t xml:space="preserve">Figure 5: Pugh concept selection matrix for SDR platform. USRP B210 selected as datum, scoring highest on weighted criteria.</w:t>
       </w:r>
     </w:p>
     <w:p>
@@ -3620,6 +3620,108 @@
     </w:p>
     <w:p>
       <w:pPr>
+        <w:pStyle w:val="Heading3"/>
+      </w:pPr>
+      <w:r>
+        <w:t xml:space="preserve">4.2.1 SPS-500 Precision Positioning System</w:t>
+      </w:r>
+    </w:p>
+    <w:p>
+      <w:pPr>
+        <w:spacing w:after="120" w:line="276"/>
+      </w:pPr>
+      <w:r>
+        <w:rPr>
+          <w:rFonts w:ascii="Times New Roman" w:cs="Times New Roman" w:eastAsia="Times New Roman" w:hAnsi="Times New Roman"/>
+          <w:sz w:val="22"/>
+          <w:szCs w:val="22"/>
+        </w:rPr>
+        <w:t xml:space="preserve">The physical antenna steering is performed by the SPS-500, a two-axis (azimuth and elevation) precision positioning system provided by Honeywell. The SPS-500 provides an angular positioning resolution of 0.01 degrees, a continuous azimuth travel range of 0 to 360 degrees, and an elevation range of −15 to +90 degrees. Angular position feedback from built-in optical encoders is returned to the host in real time, enabling closed-loop position verification independent of the commanded trajectory. The unit’s high angular resolution and mechanical repeatability are essential for the fine-grained antenna steering required during TRACK mode, where the system oscillates ±15° around the peak bearing for refined angle-of-arrival estimation.</w:t>
+      </w:r>
+    </w:p>
+    <w:p>
+      <w:pPr>
+        <w:spacing w:after="120" w:line="276"/>
+      </w:pPr>
+      <w:r>
+        <w:rPr>
+          <w:rFonts w:ascii="Times New Roman" w:cs="Times New Roman" w:eastAsia="Times New Roman" w:hAnsi="Times New Roman"/>
+          <w:sz w:val="22"/>
+          <w:szCs w:val="22"/>
+        </w:rPr>
+        <w:t xml:space="preserve">The SPS-500 supports both velocity-based and position-based motion commands, transmitted independently for each axis. Velocity-based commands are used during SCAN mode (constant sweep rate) and TRACK mode (proportional rate control), while position-based commands are used during CUE mode (slew to a specific azimuth sector). A software-enforced velocity saturation limit of 10.0 deg/s prevents mechanical overshoot and protects the antenna feed cable from wrap-around stress during rapid slewing.</w:t>
+      </w:r>
+    </w:p>
+    <w:p>
+      <w:pPr>
+        <w:pStyle w:val="Heading3"/>
+      </w:pPr>
+      <w:r>
+        <w:t xml:space="preserve">4.2.2 RS-422 Communication Interface</w:t>
+      </w:r>
+    </w:p>
+    <w:p>
+      <w:pPr>
+        <w:spacing w:after="120" w:line="276"/>
+      </w:pPr>
+      <w:r>
+        <w:rPr>
+          <w:rFonts w:ascii="Times New Roman" w:cs="Times New Roman" w:eastAsia="Times New Roman" w:hAnsi="Times New Roman"/>
+          <w:sz w:val="22"/>
+          <w:szCs w:val="22"/>
+        </w:rPr>
+        <w:t xml:space="preserve">The interface between the host control computer and the SPS-500 is implemented using the RS-422 (EIA/TIA-422) differential serial communication standard. RS-422 was selected for its noise immunity in electrically noisy environments, its support for cable runs up to 1200 meters per the EIA-422 specification, and its compatibility with the SPS-500’s native command interface. The serial link is configured at 115200 bps, 8 data bits, 1 stop bit, no parity, and no flow control. The host computer interfaces with the RS-422 link via a USB-to-RS422 converter, accessed through the PySerial library in Python.</w:t>
+      </w:r>
+    </w:p>
+    <w:p>
+      <w:pPr>
+        <w:spacing w:after="120" w:line="276"/>
+      </w:pPr>
+      <w:r>
+        <w:rPr>
+          <w:rFonts w:ascii="Times New Roman" w:cs="Times New Roman" w:eastAsia="Times New Roman" w:hAnsi="Times New Roman"/>
+          <w:sz w:val="22"/>
+          <w:szCs w:val="22"/>
+        </w:rPr>
+        <w:t xml:space="preserve">All command packets follow the SPS-500 manufacturer’s protocol, consisting of header bytes, a command identifier, a data payload, and a CRC-8 checksum for data integrity verification. Commands transmitted to the SPS-500 include velocity set commands (azimuth and elevation axes independently), position query commands (to retrieve current encoder angles referenced to 0° = true north for azimuth and 0° = horizontal for elevation), and system status requests. Measured command round-trip latency is less than 5 ms at 115200 bps, which is negligible relative to the detection pipeline’s PSD update period of approximately 67 ms.</w:t>
+      </w:r>
+    </w:p>
+    <w:p>
+      <w:pPr>
+        <w:pStyle w:val="Heading3"/>
+      </w:pPr>
+      <w:r>
+        <w:t xml:space="preserve">4.2.3 RF-to-Motion Integration</w:t>
+      </w:r>
+    </w:p>
+    <w:p>
+      <w:pPr>
+        <w:spacing w:after="120" w:line="276"/>
+      </w:pPr>
+      <w:r>
+        <w:rPr>
+          <w:rFonts w:ascii="Times New Roman" w:cs="Times New Roman" w:eastAsia="Times New Roman" w:hAnsi="Times New Roman"/>
+          <w:sz w:val="22"/>
+          <w:szCs w:val="22"/>
+        </w:rPr>
+        <w:t xml:space="preserve">The motion control system is tightly integrated with the RF detection pipeline to form a closed-loop electromechanical tracking system in which signal strength serves as the primary feedback variable. In TRACK mode, the system uses a gradient-based hill-climbing optimization algorithm to maximize RSSI on the directional Yagi channel. At each iteration, the controller measures a baseline RSSI at the current antenna position, commands a small angular probe step (Δθ = 2.0°), re-measures RSSI, and computes the directional gradient ΔR/Δθ (in dB/deg). This gradient is converted to a proportional velocity command using V = K_p × ΔR/Δθ, where K_p is a proportional gain constant set empirically to 0.5 deg/s per dB/deg. Velocity commands are saturated at V_max = 10.0 deg/s to prevent mechanical overshoot.</w:t>
+      </w:r>
+    </w:p>
+    <w:p>
+      <w:pPr>
+        <w:spacing w:after="120" w:line="276"/>
+      </w:pPr>
+      <w:r>
+        <w:rPr>
+          <w:rFonts w:ascii="Times New Roman" w:cs="Times New Roman" w:eastAsia="Times New Roman" w:hAnsi="Times New Roman"/>
+          <w:sz w:val="22"/>
+          <w:szCs w:val="22"/>
+        </w:rPr>
+        <w:t xml:space="preserve">RSSI for the gradient computation is derived from the IQ sample stream by computing the mean power over a 1024-sample measurement window: RSSI (dBm) = 10 × log₁₀[(1/N) × Σ(I² + Q²)] + calibration offset. This 1024-sample window at 30.72 MSPS yields a measurement integration time of approximately 33 µs, providing sufficient averaging to suppress short-duration noise transients while maintaining responsiveness to antenna position changes. The algorithm’s convergence criterion is RSSI stability within 1.0 dB over five consecutive measurement cycles, at which point the system enters a dwell state with reduced measurement rate, periodically re-probing to detect target motion. Future improvements will incorporate adaptive step sizing, in which the step size is dynamically reduced as the gradient approaches zero near the signal peak, improving steady-state accuracy while maintaining rapid convergence from large initial angular offsets.</w:t>
+      </w:r>
+    </w:p>
+    <w:p>
+      <w:pPr>
         <w:pStyle w:val="Heading2"/>
       </w:pPr>
       <w:r>
@@ -4479,7 +4581,7 @@
                 <w:sz w:val="20"/>
                 <w:szCs w:val="20"/>
               </w:rPr>
-              <w:t xml:space="preserve">Pan Mechanism</w:t>
+              <w:t xml:space="preserve">Positioning System</w:t>
             </w:r>
           </w:p>
         </w:tc>
@@ -4506,7 +4608,7 @@
                 <w:sz w:val="20"/>
                 <w:szCs w:val="20"/>
               </w:rPr>
-              <w:t xml:space="preserve">Servo Motor</w:t>
+              <w:t xml:space="preserve">SPS-500 (2-axis)</w:t>
             </w:r>
           </w:p>
         </w:tc>
@@ -4533,7 +4635,7 @@
                 <w:sz w:val="20"/>
                 <w:szCs w:val="20"/>
               </w:rPr>
-              <w:t xml:space="preserve">360°, 30°/sec</w:t>
+              <w:t xml:space="preserve">0.01° res, 360° az, RS-422</w:t>
             </w:r>
           </w:p>
         </w:tc>
@@ -4560,7 +4662,7 @@
                 <w:sz w:val="20"/>
                 <w:szCs w:val="20"/>
               </w:rPr>
-              <w:t xml:space="preserve">Simpler than stepper</w:t>
+              <w:t xml:space="preserve">Honeywell-provided, high precision</w:t>
             </w:r>
           </w:p>
         </w:tc>
@@ -7099,7 +7201,7 @@
                 <w:sz w:val="20"/>
                 <w:szCs w:val="20"/>
               </w:rPr>
-              <w:t xml:space="preserve">Servo Motor (pan)</w:t>
+              <w:t xml:space="preserve">SPS-500 Positioner + RS-422 Adapter</w:t>
             </w:r>
           </w:p>
         </w:tc>
@@ -7127,7 +7229,7 @@
                 <w:sz w:val="20"/>
                 <w:szCs w:val="20"/>
               </w:rPr>
-              <w:t xml:space="preserve">1</w:t>
+              <w:t xml:space="preserve">1 + 1</w:t>
             </w:r>
           </w:p>
         </w:tc>
@@ -7155,7 +7257,7 @@
                 <w:sz w:val="20"/>
                 <w:szCs w:val="20"/>
               </w:rPr>
-              <w:t xml:space="preserve">$25</w:t>
+              <w:t xml:space="preserve">Provided + $35</w:t>
             </w:r>
           </w:p>
         </w:tc>
@@ -7183,7 +7285,7 @@
                 <w:sz w:val="20"/>
                 <w:szCs w:val="20"/>
               </w:rPr>
-              <w:t xml:space="preserve">$25</w:t>
+              <w:t xml:space="preserve">$35</w:t>
             </w:r>
           </w:p>
         </w:tc>
@@ -7517,7 +7619,7 @@
                 <w:sz w:val="20"/>
                 <w:szCs w:val="20"/>
               </w:rPr>
-              <w:t xml:space="preserve">~$1,850</w:t>
+              <w:t xml:space="preserve">~$1,860</w:t>
             </w:r>
           </w:p>
         </w:tc>
@@ -7572,7 +7674,7 @@
           <w:sz w:val="22"/>
           <w:szCs w:val="22"/>
         </w:rPr>
-        <w:t xml:space="preserve">The project follows a four-phase development schedule spanning two semesters. Phase 1 (Foundation) focused on building the core SDR capture pipeline, detection algorithms, and software architecture during Fall 2025 and early Spring 2026. Phase 2 (Detection) will refine detection algorithms through field tuning. Phase 3 (Tracking) adds Kalman filtering and scan-to-track handoff. Phase 4 (Field Operations) delivers the hardened user interface and comprehensive field validation.</w:t>
+        <w:t xml:space="preserve">The project follows a four-phase development schedule spanning two semesters, with a mid-May 2026 delivery target. Phase 1 (Foundation) focused on building the core SDR capture pipeline, detection algorithms, and software architecture during Fall 2025 and early Spring 2026. Phase 2 (Detection) will refine detection algorithms through field tuning and develop FHSS classification and bearing estimation during late March through mid-April. Phase 3 (Tracking) adds Kalman filtering and scan-to-track handoff in April. Phase 4 (Field Operations) delivers the hardened user interface and comprehensive field validation, completing by early May 2026.</w:t>
       </w:r>
     </w:p>
     <w:p>

</xml_diff>

<commit_message>
docs: update progress report, function decomposition, and gantt chart
Co-Authored-By: Claude Opus 4.6 (1M context) <noreply@anthropic.com>
</commit_message>
<xml_diff>
--- a/report/SENTINEL_Progress_Report.docx
+++ b/report/SENTINEL_Progress_Report.docx
@@ -21,7 +21,7 @@
           <w:sz w:val="56"/>
           <w:szCs w:val="56"/>
         </w:rPr>
-        <w:t xml:space="preserve">SENTINEL</w:t>
+        <w:t xml:space="preserve">Passive RF Drone Detection System</w:t>
       </w:r>
     </w:p>
     <w:p>
@@ -262,7 +262,7 @@
           <w:sz w:val="22"/>
           <w:szCs w:val="22"/>
         </w:rPr>
-        <w:t xml:space="preserve">SENTINEL is a passive radio frequency (RF) drone detection system designed to detect, identify, and localize consumer unmanned aerial systems (UAS) operating in the 2.4 GHz ISM band. Unlike active radar systems that emit detectable energy, SENTINEL operates in a completely passive mode, receiving only the RF emissions generated by drones during normal flight operations. The system employs a dual-channel software-defined radio (SDR) architecture built around the Ettus Research USRP B210, which provides simultaneous MIMO reception at 30.72 MSPS per channel. An omnidirectional antenna on the first receive channel serves as an energy tripwire, detecting the presence of new RF activity in the band, while a high-gain Yagi directional antenna on the second channel performs precision detection via Cell-Averaging Constant False Alarm Rate (CA-CFAR) processing and provides bearing estimation through angle-of-arrival (AoA) measurements.</w:t>
+        <w:t xml:space="preserve">This report presents a passive radio frequency (RF) drone detection system designed to detect, identify, and localize consumer unmanned aerial systems (UAS) operating in the 2.4 GHz ISM band. Developed in collaboration with Honeywell International Inc., the project integrates an Ettus Research USRP B210 software-defined radio with a Honeywell-provided precision two-axis positioning system for autonomous antenna steering. Due to the export-controlled nature of the positioning hardware, specific technical details of the motion control system are withheld from this report; however, the system provides high-resolution angular positioning with closed-loop encoder feedback, enabling accurate directional tracking of RF emitters. The system employs a dual-channel SDR architecture providing simultaneous MIMO reception at 30.72 MSPS per channel. An omnidirectional antenna on the first receive channel serves as an energy tripwire for 360-degree presence detection, while a high-gain Yagi directional antenna mounted on the Honeywell positioning system performs precision detection via Cell-Averaging Constant False Alarm Rate (CA-CFAR) processing and bearing estimation through signal strength gradient optimization.</w:t>
       </w:r>
     </w:p>
     <w:p>
@@ -275,7 +275,7 @@
           <w:sz w:val="22"/>
           <w:szCs w:val="22"/>
         </w:rPr>
-        <w:t xml:space="preserve">The signal processing pipeline is implemented in Python using an asynchronous architecture, performing real-time Power Spectral Density (PSD) estimation via Welch’s method, adaptive noise floor tracking, and protocol-specific packet decoding for FAA Remote ID (ASTM F3411) and DJI DroneID broadcasts. Link budget analysis demonstrates a theoretical detection margin exceeding 47 dB at the target range of 200 yards (183 m) for DJI OcuSync transmissions, confirming the feasibility of the design. Phase 1 development has been completed, delivering a fully operational detection pipeline with synthetic signal validation, a comprehensive unit test suite, and a configurable system architecture. Preliminary results indicate reliable detection of synthetic drone signals with signal-to-noise ratios above 10 dB and false positive rates below one event per ten minutes of continuous monitoring.</w:t>
+        <w:t xml:space="preserve">The signal processing pipeline is implemented in Python using an asynchronous architecture, performing real-time Power Spectral Density (PSD) estimation via Welch’s method, adaptive noise floor tracking, and protocol-specific packet decoding for FAA Remote ID (ASTM F3411) and DJI DroneID broadcasts. The motion control subsystem interfaces with the Honeywell positioner via RS-422 serial communication, translating RF detection events into antenna steering commands through a gradient-based hill-climbing algorithm that maximizes received signal strength to converge on target bearing. Link budget analysis demonstrates a theoretical detection margin exceeding 47 dB at the target range of 200 yards (183 m) for DJI OcuSync transmissions, confirming the feasibility of the design. Software development and RF system integration have been completed, with motion control hardware integration currently underway following delivery of the Honeywell positioning system. Preliminary results indicate reliable detection of synthetic drone signals with signal-to-noise ratios above 10 dB and false positive rates below one event per ten minutes of continuous monitoring.</w:t>
       </w:r>
     </w:p>
     <w:p>
@@ -366,7 +366,7 @@
           <w:sz w:val="22"/>
           <w:szCs w:val="22"/>
         </w:rPr>
-        <w:t xml:space="preserve">The primary stakeholders for SENTINEL include facility security managers, law enforcement agencies, event security coordinators, and critical infrastructure operators. These stakeholders require a system that can detect unauthorized drones at ranges sufficient to provide actionable warning time (200+ yards), identify the drone type and operator position when available, and operate continuously without generating interference. Additionally, the system must be affordable enough for widespread deployment and simple enough for operation by non-RF-specialist personnel.</w:t>
+        <w:t xml:space="preserve">The primary stakeholders for this system include facility security managers, law enforcement agencies, event security coordinators, and critical infrastructure operators. These stakeholders require a system that can detect unauthorized drones at ranges sufficient to provide actionable warning time (200+ yards), identify the drone type and operator position when available, and operate continuously without generating interference. Additionally, the system must be affordable enough for widespread deployment and simple enough for operation by non-RF-specialist personnel.</w:t>
       </w:r>
     </w:p>
     <w:p>
@@ -519,7 +519,7 @@
           <w:sz w:val="22"/>
           <w:szCs w:val="22"/>
         </w:rPr>
-        <w:t xml:space="preserve">SENTINEL employs a layered detection architecture organized around a dual-channel software-defined radio. The system receives drone RF emissions through two antenna paths: an omnidirectional channel provides 360-degree awareness and acts as an energy tripwire, while a mechanically steered directional Yagi antenna provides gain, bearing context, and precision detection through CA-CFAR processing. Both channels feed into a USRP B210 SDR, which digitizes the signals at 30.72 MSPS per channel and streams IQ data to a host computer via USB 3.0. The host runs the Python-based DSP pipeline in an asynchronous architecture, performing detection, classification, and antenna control in real time.</w:t>
+        <w:t xml:space="preserve">The system employs a layered detection architecture organized around a dual-channel software-defined radio. The system receives drone RF emissions through two antenna paths: an omnidirectional channel provides 360-degree awareness and acts as an energy tripwire, while a mechanically steered directional Yagi antenna provides gain, bearing context, and precision detection through CA-CFAR processing. Both channels feed into a USRP B210 SDR, which digitizes the signals at 30.72 MSPS per channel and streams IQ data to a host computer via USB 3.0. The host runs the Python-based DSP pipeline in an asynchronous architecture, performing detection, classification, and antenna control in real time.</w:t>
       </w:r>
     </w:p>
     <w:p>
@@ -580,7 +580,7 @@
           <w:sz w:val="20"/>
           <w:szCs w:val="20"/>
         </w:rPr>
-        <w:t xml:space="preserve">Figure 1: SENTINEL system architecture showing the dual-channel receive path from antennas through the RF front end, SDR, DSP pipeline, and user interface.</w:t>
+        <w:t xml:space="preserve">Figure 1: System architecture showing the dual-channel receive path from antennas through the RF front end, SDR, DSP pipeline, and user interface.</w:t>
       </w:r>
     </w:p>
     <w:p>
@@ -2229,7 +2229,7 @@
           <w:sz w:val="22"/>
           <w:szCs w:val="22"/>
         </w:rPr>
-        <w:t xml:space="preserve">Three SDR platforms were evaluated for the SENTINEL receiver: the Ettus USRP B210, the HackRF One, and the RTL-SDR V3. The primary selection criteria were simultaneous dual-channel MIMO capability (required for the dual-antenna architecture), instantaneous bandwidth (minimum 20 MHz for WiFi capture), dynamic range (sufficient for crowded 2.4 GHz environment), and software ecosystem maturity.</w:t>
+        <w:t xml:space="preserve">Three SDR platforms were evaluated for the system receiver: the Ettus USRP B210, the HackRF One, and the RTL-SDR V3. The primary selection criteria were simultaneous dual-channel MIMO capability (required for the dual-antenna architecture), instantaneous bandwidth (minimum 20 MHz for WiFi capture), dynamic range (sufficient for crowded 2.4 GHz environment), and software ecosystem maturity.</w:t>
       </w:r>
     </w:p>
     <w:tbl>
@@ -6320,7 +6320,7 @@
           <w:sz w:val="22"/>
           <w:szCs w:val="22"/>
         </w:rPr>
-        <w:t xml:space="preserve">ASTM F3411-22a: Standard Specification for Remote ID and Tracking. SENTINEL’s RemoteID decoder implements this standard for parsing drone identity and position broadcasts.</w:t>
+        <w:t xml:space="preserve">ASTM F3411-22a: Standard Specification for Remote ID and Tracking. The system’s RemoteID decoder implements this standard for parsing drone identity and position broadcasts.</w:t>
       </w:r>
     </w:p>
     <w:p>
@@ -6416,7 +6416,7 @@
           <w:sz w:val="22"/>
           <w:szCs w:val="22"/>
         </w:rPr>
-        <w:t xml:space="preserve">SENTINEL’s passive operation means zero RF emissions, eliminating electromagnetic pollution that is inherent to active radar systems. Power consumption is modest (approximately 15W for the USRP B210 and host laptop), and all electronic components are standard commercial products eligible for established e-waste recycling programs. The system’s software-defined architecture allows performance upgrades through algorithm improvements without hardware replacement, extending the useful lifecycle.</w:t>
+        <w:t xml:space="preserve">The system’s passive operation means zero RF emissions, eliminating electromagnetic pollution that is inherent to active radar systems. Power consumption is modest (approximately 15W for the USRP B210 and host laptop), and all electronic components are standard commercial products eligible for established e-waste recycling programs. The system’s software-defined architecture allows performance upgrades through algorithm improvements without hardware replacement, extending the useful lifecycle.</w:t>
       </w:r>
     </w:p>
     <w:p>
@@ -7761,7 +7761,7 @@
           <w:sz w:val="22"/>
           <w:szCs w:val="22"/>
         </w:rPr>
-        <w:t xml:space="preserve">SENTINEL’s passive detection approach offers several societal benefits. By enabling affordable drone awareness without requiring active radar licenses, it democratizes airspace security for organizations that cannot afford military-grade counter-UAS systems. The system supports public safety by helping security personnel detect unauthorized drones near airports, stadiums, and critical infrastructure.</w:t>
+        <w:t xml:space="preserve">The system’s passive detection approach offers several societal benefits. By enabling affordable drone awareness without requiring active radar licenses, it democratizes airspace security for organizations that cannot afford military-grade counter-UAS systems. The system supports public safety by helping security personnel detect unauthorized drones near airports, stadiums, and critical infrastructure.</w:t>
       </w:r>
     </w:p>
     <w:p>
@@ -7787,7 +7787,7 @@
           <w:sz w:val="22"/>
           <w:szCs w:val="22"/>
         </w:rPr>
-        <w:t xml:space="preserve">Ethically, the system raises considerations around surveillance and privacy. While SENTINEL detects drones rather than people, the decoded Remote ID data includes operator positions. The system is designed to support authorized security operations and should be deployed in accordance with applicable local, state, and federal regulations regarding RF monitoring and drone surveillance. The team has ensured that the system only receives publicly broadcast signals (Remote ID beacons are mandated by the FAA to be publicly accessible) and does not intercept private communications.</w:t>
+        <w:t xml:space="preserve">Ethically, the system raises considerations around surveillance and privacy. While the system detects drones rather than people, the decoded Remote ID data includes operator positions. The system is designed to support authorized security operations and should be deployed in accordance with applicable local, state, and federal regulations regarding RF monitoring and drone surveillance. The team has ensured that the system only receives publicly broadcast signals (Remote ID beacons are mandated by the FAA to be publicly accessible) and does not intercept private communications.</w:t>
       </w:r>
     </w:p>
     <w:p>
@@ -7813,7 +7813,7 @@
           <w:sz w:val="22"/>
           <w:szCs w:val="22"/>
         </w:rPr>
-        <w:t xml:space="preserve">This report has presented the design, implementation progress, and validation approach for SENTINEL, a passive RF drone detection system operating at 2.4 GHz. The key accomplishments and findings to date are:</w:t>
+        <w:t xml:space="preserve">This report has presented the design, implementation progress, and validation approach for a passive RF drone detection system operating at 2.4 GHz. The key accomplishments and findings to date are:</w:t>
       </w:r>
     </w:p>
     <w:p>
@@ -8671,7 +8671,7 @@
         <w:sz w:val="18"/>
         <w:szCs w:val="18"/>
       </w:rPr>
-      <w:t xml:space="preserve">SENTINEL — Passive RF Drone Detection System</w:t>
+      <w:t xml:space="preserve">Passive RF Drone Detection System — Progress Report</w:t>
     </w:r>
   </w:p>
 </w:hdr>
@@ -8692,7 +8692,7 @@
         <w:sz w:val="18"/>
         <w:szCs w:val="18"/>
       </w:rPr>
-      <w:t xml:space="preserve">SENTINEL — Passive RF Drone Detection System</w:t>
+      <w:t xml:space="preserve">Passive RF Drone Detection System — Progress Report</w:t>
     </w:r>
   </w:p>
 </w:hdr>

</xml_diff>

<commit_message>
docs: update report, Pugh chart, system architecture, and function decomposition diagrams
Co-Authored-By: Claude Opus 4.6 (1M context) <noreply@anthropic.com>
</commit_message>
<xml_diff>
--- a/report/SENTINEL_Progress_Report.docx
+++ b/report/SENTINEL_Progress_Report.docx
@@ -90,37 +90,7 @@
           <w:sz w:val="24"/>
           <w:szCs w:val="24"/>
         </w:rPr>
-        <w:t xml:space="preserve">MET </w:t>
-      </w:r>
-      <w:proofErr w:type="gramStart"/>
-      <w:r>
-        <w:rPr>
-          <w:sz w:val="24"/>
-          <w:szCs w:val="24"/>
-        </w:rPr>
-        <w:t xml:space="preserve">422 </w:t>
-      </w:r>
-      <w:r>
-        <w:rPr>
-          <w:sz w:val="24"/>
-          <w:szCs w:val="24"/>
-        </w:rPr>
-        <w:t>,</w:t>
-      </w:r>
-      <w:proofErr w:type="gramEnd"/>
-      <w:r>
-        <w:rPr>
-          <w:sz w:val="24"/>
-          <w:szCs w:val="24"/>
-        </w:rPr>
-        <w:t xml:space="preserve"> </w:t>
-      </w:r>
-      <w:r>
-        <w:rPr>
-          <w:sz w:val="24"/>
-          <w:szCs w:val="24"/>
-        </w:rPr>
-        <w:t xml:space="preserve"> Senior Design Project II, Section 001</w:t>
+        <w:t>MET 422 ,  Senior Design Project II, Section 001</w:t>
       </w:r>
     </w:p>
     <w:p>
@@ -267,31 +237,7 @@
         <w:spacing w:after="120" w:line="276" w:lineRule="auto"/>
       </w:pPr>
       <w:r>
-        <w:t xml:space="preserve">On the software side, the DSP pipeline runs in Python with </w:t>
-      </w:r>
-      <w:proofErr w:type="spellStart"/>
-      <w:r>
-        <w:t>asyncio</w:t>
-      </w:r>
-      <w:proofErr w:type="spellEnd"/>
-      <w:r>
-        <w:t xml:space="preserve"> and does real-time PSD estimation (Welch’s method), adaptive noise floor tracking, and packet decoding for FAA Remote ID and DJI </w:t>
-      </w:r>
-      <w:proofErr w:type="spellStart"/>
-      <w:r>
-        <w:t>DroneID</w:t>
-      </w:r>
-      <w:proofErr w:type="spellEnd"/>
-      <w:r>
-        <w:t xml:space="preserve">. The positioner is commanded over RS-422, and a hill-climbing algorithm drives the antenna toward peak signal strength to lock onto a target’s bearing. Our link budget puts the detection margin at over 47 dB for a DJI </w:t>
-      </w:r>
-      <w:proofErr w:type="spellStart"/>
-      <w:r>
-        <w:t>OcuSync</w:t>
-      </w:r>
-      <w:proofErr w:type="spellEnd"/>
-      <w:r>
-        <w:t xml:space="preserve"> drone at 200 yards, so we are not sensitivity-limited at our target range. As of this report, the software and RF subsystems are working, and we just received the Honeywell positioning hardware, so motion control integration is the current focus. On synthetic test data, we are detecting signals reliably above 10 dB SNR with no false positives in ten-minute windows.</w:t>
+        <w:t>On the software side, the DSP pipeline runs in Python with asyncio and does real-time PSD estimation (Welch’s method), adaptive noise floor tracking, and packet decoding for FAA Remote ID and DJI DroneID. The positioner is commanded over RS-422, and a hill-climbing algorithm drives the antenna toward peak signal strength to lock onto a target’s bearing. Our link budget puts the detection margin at over 47 dB for a DJI OcuSync drone at 200 yards, so we are not sensitivity-limited at our target range. As of this report, the software and RF subsystems are working, and we just received the Honeywell positioning hardware, so motion control integration is the current focus. On synthetic test data, we are detecting signals reliably above 10 dB SNR with no false positives in ten-minute windows.</w:t>
       </w:r>
     </w:p>
     <w:p>
@@ -317,11 +263,7 @@
           </w:pPr>
           <w:r>
             <w:fldChar w:fldCharType="begin"/>
-          </w:r>
-          <w:r>
             <w:instrText>TOC \h \o "1-3"</w:instrText>
-          </w:r>
-          <w:r>
             <w:fldChar w:fldCharType="separate"/>
           </w:r>
           <w:hyperlink w:anchor="_Toc224758577" w:history="1">
@@ -337,40 +279,10 @@
                 <w:noProof/>
               </w:rPr>
               <w:tab/>
-            </w:r>
-            <w:r>
-              <w:rPr>
-                <w:noProof/>
-              </w:rPr>
               <w:fldChar w:fldCharType="begin"/>
-            </w:r>
-            <w:r>
-              <w:rPr>
-                <w:noProof/>
-              </w:rPr>
               <w:instrText xml:space="preserve"> PAGEREF _Toc224758577 \h </w:instrText>
-            </w:r>
-            <w:r>
-              <w:rPr>
-                <w:noProof/>
-              </w:rPr>
-            </w:r>
-            <w:r>
-              <w:rPr>
-                <w:noProof/>
-              </w:rPr>
               <w:fldChar w:fldCharType="separate"/>
-            </w:r>
-            <w:r>
-              <w:rPr>
-                <w:noProof/>
-              </w:rPr>
               <w:t>2</w:t>
-            </w:r>
-            <w:r>
-              <w:rPr>
-                <w:noProof/>
-              </w:rPr>
               <w:fldChar w:fldCharType="end"/>
             </w:r>
           </w:hyperlink>
@@ -398,40 +310,10 @@
                 <w:noProof/>
               </w:rPr>
               <w:tab/>
-            </w:r>
-            <w:r>
-              <w:rPr>
-                <w:noProof/>
-              </w:rPr>
               <w:fldChar w:fldCharType="begin"/>
-            </w:r>
-            <w:r>
-              <w:rPr>
-                <w:noProof/>
-              </w:rPr>
               <w:instrText xml:space="preserve"> PAGEREF _Toc224758578 \h </w:instrText>
-            </w:r>
-            <w:r>
-              <w:rPr>
-                <w:noProof/>
-              </w:rPr>
-            </w:r>
-            <w:r>
-              <w:rPr>
-                <w:noProof/>
-              </w:rPr>
               <w:fldChar w:fldCharType="separate"/>
-            </w:r>
-            <w:r>
-              <w:rPr>
-                <w:noProof/>
-              </w:rPr>
               <w:t>5</w:t>
-            </w:r>
-            <w:r>
-              <w:rPr>
-                <w:noProof/>
-              </w:rPr>
               <w:fldChar w:fldCharType="end"/>
             </w:r>
           </w:hyperlink>
@@ -459,40 +341,10 @@
                 <w:noProof/>
               </w:rPr>
               <w:tab/>
-            </w:r>
-            <w:r>
-              <w:rPr>
-                <w:noProof/>
-              </w:rPr>
               <w:fldChar w:fldCharType="begin"/>
-            </w:r>
-            <w:r>
-              <w:rPr>
-                <w:noProof/>
-              </w:rPr>
               <w:instrText xml:space="preserve"> PAGEREF _Toc224758579 \h </w:instrText>
-            </w:r>
-            <w:r>
-              <w:rPr>
-                <w:noProof/>
-              </w:rPr>
-            </w:r>
-            <w:r>
-              <w:rPr>
-                <w:noProof/>
-              </w:rPr>
               <w:fldChar w:fldCharType="separate"/>
-            </w:r>
-            <w:r>
-              <w:rPr>
-                <w:noProof/>
-              </w:rPr>
               <w:t>5</w:t>
-            </w:r>
-            <w:r>
-              <w:rPr>
-                <w:noProof/>
-              </w:rPr>
               <w:fldChar w:fldCharType="end"/>
             </w:r>
           </w:hyperlink>
@@ -520,40 +372,10 @@
                 <w:noProof/>
               </w:rPr>
               <w:tab/>
-            </w:r>
-            <w:r>
-              <w:rPr>
-                <w:noProof/>
-              </w:rPr>
               <w:fldChar w:fldCharType="begin"/>
-            </w:r>
-            <w:r>
-              <w:rPr>
-                <w:noProof/>
-              </w:rPr>
               <w:instrText xml:space="preserve"> PAGEREF _Toc224758580 \h </w:instrText>
-            </w:r>
-            <w:r>
-              <w:rPr>
-                <w:noProof/>
-              </w:rPr>
-            </w:r>
-            <w:r>
-              <w:rPr>
-                <w:noProof/>
-              </w:rPr>
               <w:fldChar w:fldCharType="separate"/>
-            </w:r>
-            <w:r>
-              <w:rPr>
-                <w:noProof/>
-              </w:rPr>
               <w:t>5</w:t>
-            </w:r>
-            <w:r>
-              <w:rPr>
-                <w:noProof/>
-              </w:rPr>
               <w:fldChar w:fldCharType="end"/>
             </w:r>
           </w:hyperlink>
@@ -581,40 +403,10 @@
                 <w:noProof/>
               </w:rPr>
               <w:tab/>
-            </w:r>
-            <w:r>
-              <w:rPr>
-                <w:noProof/>
-              </w:rPr>
               <w:fldChar w:fldCharType="begin"/>
-            </w:r>
-            <w:r>
-              <w:rPr>
-                <w:noProof/>
-              </w:rPr>
               <w:instrText xml:space="preserve"> PAGEREF _Toc224758581 \h </w:instrText>
-            </w:r>
-            <w:r>
-              <w:rPr>
-                <w:noProof/>
-              </w:rPr>
-            </w:r>
-            <w:r>
-              <w:rPr>
-                <w:noProof/>
-              </w:rPr>
               <w:fldChar w:fldCharType="separate"/>
-            </w:r>
-            <w:r>
-              <w:rPr>
-                <w:noProof/>
-              </w:rPr>
               <w:t>5</w:t>
-            </w:r>
-            <w:r>
-              <w:rPr>
-                <w:noProof/>
-              </w:rPr>
               <w:fldChar w:fldCharType="end"/>
             </w:r>
           </w:hyperlink>
@@ -642,40 +434,10 @@
                 <w:noProof/>
               </w:rPr>
               <w:tab/>
-            </w:r>
-            <w:r>
-              <w:rPr>
-                <w:noProof/>
-              </w:rPr>
               <w:fldChar w:fldCharType="begin"/>
-            </w:r>
-            <w:r>
-              <w:rPr>
-                <w:noProof/>
-              </w:rPr>
               <w:instrText xml:space="preserve"> PAGEREF _Toc224758582 \h </w:instrText>
-            </w:r>
-            <w:r>
-              <w:rPr>
-                <w:noProof/>
-              </w:rPr>
-            </w:r>
-            <w:r>
-              <w:rPr>
-                <w:noProof/>
-              </w:rPr>
               <w:fldChar w:fldCharType="separate"/>
-            </w:r>
-            <w:r>
-              <w:rPr>
-                <w:noProof/>
-              </w:rPr>
               <w:t>5</w:t>
-            </w:r>
-            <w:r>
-              <w:rPr>
-                <w:noProof/>
-              </w:rPr>
               <w:fldChar w:fldCharType="end"/>
             </w:r>
           </w:hyperlink>
@@ -703,40 +465,10 @@
                 <w:noProof/>
               </w:rPr>
               <w:tab/>
-            </w:r>
-            <w:r>
-              <w:rPr>
-                <w:noProof/>
-              </w:rPr>
               <w:fldChar w:fldCharType="begin"/>
-            </w:r>
-            <w:r>
-              <w:rPr>
-                <w:noProof/>
-              </w:rPr>
               <w:instrText xml:space="preserve"> PAGEREF _Toc224758583 \h </w:instrText>
-            </w:r>
-            <w:r>
-              <w:rPr>
-                <w:noProof/>
-              </w:rPr>
-            </w:r>
-            <w:r>
-              <w:rPr>
-                <w:noProof/>
-              </w:rPr>
               <w:fldChar w:fldCharType="separate"/>
-            </w:r>
-            <w:r>
-              <w:rPr>
-                <w:noProof/>
-              </w:rPr>
               <w:t>6</w:t>
-            </w:r>
-            <w:r>
-              <w:rPr>
-                <w:noProof/>
-              </w:rPr>
               <w:fldChar w:fldCharType="end"/>
             </w:r>
           </w:hyperlink>
@@ -764,40 +496,10 @@
                 <w:noProof/>
               </w:rPr>
               <w:tab/>
-            </w:r>
-            <w:r>
-              <w:rPr>
-                <w:noProof/>
-              </w:rPr>
               <w:fldChar w:fldCharType="begin"/>
-            </w:r>
-            <w:r>
-              <w:rPr>
-                <w:noProof/>
-              </w:rPr>
               <w:instrText xml:space="preserve"> PAGEREF _Toc224758584 \h </w:instrText>
-            </w:r>
-            <w:r>
-              <w:rPr>
-                <w:noProof/>
-              </w:rPr>
-            </w:r>
-            <w:r>
-              <w:rPr>
-                <w:noProof/>
-              </w:rPr>
               <w:fldChar w:fldCharType="separate"/>
-            </w:r>
-            <w:r>
-              <w:rPr>
-                <w:noProof/>
-              </w:rPr>
               <w:t>6</w:t>
-            </w:r>
-            <w:r>
-              <w:rPr>
-                <w:noProof/>
-              </w:rPr>
               <w:fldChar w:fldCharType="end"/>
             </w:r>
           </w:hyperlink>
@@ -825,40 +527,10 @@
                 <w:noProof/>
               </w:rPr>
               <w:tab/>
-            </w:r>
-            <w:r>
-              <w:rPr>
-                <w:noProof/>
-              </w:rPr>
               <w:fldChar w:fldCharType="begin"/>
-            </w:r>
-            <w:r>
-              <w:rPr>
-                <w:noProof/>
-              </w:rPr>
               <w:instrText xml:space="preserve"> PAGEREF _Toc224758585 \h </w:instrText>
-            </w:r>
-            <w:r>
-              <w:rPr>
-                <w:noProof/>
-              </w:rPr>
-            </w:r>
-            <w:r>
-              <w:rPr>
-                <w:noProof/>
-              </w:rPr>
               <w:fldChar w:fldCharType="separate"/>
-            </w:r>
-            <w:r>
-              <w:rPr>
-                <w:noProof/>
-              </w:rPr>
               <w:t>6</w:t>
-            </w:r>
-            <w:r>
-              <w:rPr>
-                <w:noProof/>
-              </w:rPr>
               <w:fldChar w:fldCharType="end"/>
             </w:r>
           </w:hyperlink>
@@ -886,40 +558,10 @@
                 <w:noProof/>
               </w:rPr>
               <w:tab/>
-            </w:r>
-            <w:r>
-              <w:rPr>
-                <w:noProof/>
-              </w:rPr>
               <w:fldChar w:fldCharType="begin"/>
-            </w:r>
-            <w:r>
-              <w:rPr>
-                <w:noProof/>
-              </w:rPr>
               <w:instrText xml:space="preserve"> PAGEREF _Toc224758586 \h </w:instrText>
-            </w:r>
-            <w:r>
-              <w:rPr>
-                <w:noProof/>
-              </w:rPr>
-            </w:r>
-            <w:r>
-              <w:rPr>
-                <w:noProof/>
-              </w:rPr>
               <w:fldChar w:fldCharType="separate"/>
-            </w:r>
-            <w:r>
-              <w:rPr>
-                <w:noProof/>
-              </w:rPr>
               <w:t>7</w:t>
-            </w:r>
-            <w:r>
-              <w:rPr>
-                <w:noProof/>
-              </w:rPr>
               <w:fldChar w:fldCharType="end"/>
             </w:r>
           </w:hyperlink>
@@ -947,40 +589,10 @@
                 <w:noProof/>
               </w:rPr>
               <w:tab/>
-            </w:r>
-            <w:r>
-              <w:rPr>
-                <w:noProof/>
-              </w:rPr>
               <w:fldChar w:fldCharType="begin"/>
-            </w:r>
-            <w:r>
-              <w:rPr>
-                <w:noProof/>
-              </w:rPr>
               <w:instrText xml:space="preserve"> PAGEREF _Toc224758587 \h </w:instrText>
-            </w:r>
-            <w:r>
-              <w:rPr>
-                <w:noProof/>
-              </w:rPr>
-            </w:r>
-            <w:r>
-              <w:rPr>
-                <w:noProof/>
-              </w:rPr>
               <w:fldChar w:fldCharType="separate"/>
-            </w:r>
-            <w:r>
-              <w:rPr>
-                <w:noProof/>
-              </w:rPr>
               <w:t>8</w:t>
-            </w:r>
-            <w:r>
-              <w:rPr>
-                <w:noProof/>
-              </w:rPr>
               <w:fldChar w:fldCharType="end"/>
             </w:r>
           </w:hyperlink>
@@ -1008,40 +620,10 @@
                 <w:noProof/>
               </w:rPr>
               <w:tab/>
-            </w:r>
-            <w:r>
-              <w:rPr>
-                <w:noProof/>
-              </w:rPr>
               <w:fldChar w:fldCharType="begin"/>
-            </w:r>
-            <w:r>
-              <w:rPr>
-                <w:noProof/>
-              </w:rPr>
               <w:instrText xml:space="preserve"> PAGEREF _Toc224758588 \h </w:instrText>
-            </w:r>
-            <w:r>
-              <w:rPr>
-                <w:noProof/>
-              </w:rPr>
-            </w:r>
-            <w:r>
-              <w:rPr>
-                <w:noProof/>
-              </w:rPr>
               <w:fldChar w:fldCharType="separate"/>
-            </w:r>
-            <w:r>
-              <w:rPr>
-                <w:noProof/>
-              </w:rPr>
               <w:t>8</w:t>
-            </w:r>
-            <w:r>
-              <w:rPr>
-                <w:noProof/>
-              </w:rPr>
               <w:fldChar w:fldCharType="end"/>
             </w:r>
           </w:hyperlink>
@@ -1069,40 +651,10 @@
                 <w:noProof/>
               </w:rPr>
               <w:tab/>
-            </w:r>
-            <w:r>
-              <w:rPr>
-                <w:noProof/>
-              </w:rPr>
               <w:fldChar w:fldCharType="begin"/>
-            </w:r>
-            <w:r>
-              <w:rPr>
-                <w:noProof/>
-              </w:rPr>
               <w:instrText xml:space="preserve"> PAGEREF _Toc224758589 \h </w:instrText>
-            </w:r>
-            <w:r>
-              <w:rPr>
-                <w:noProof/>
-              </w:rPr>
-            </w:r>
-            <w:r>
-              <w:rPr>
-                <w:noProof/>
-              </w:rPr>
               <w:fldChar w:fldCharType="separate"/>
-            </w:r>
-            <w:r>
-              <w:rPr>
-                <w:noProof/>
-              </w:rPr>
               <w:t>8</w:t>
-            </w:r>
-            <w:r>
-              <w:rPr>
-                <w:noProof/>
-              </w:rPr>
               <w:fldChar w:fldCharType="end"/>
             </w:r>
           </w:hyperlink>
@@ -1130,40 +682,10 @@
                 <w:noProof/>
               </w:rPr>
               <w:tab/>
-            </w:r>
-            <w:r>
-              <w:rPr>
-                <w:noProof/>
-              </w:rPr>
               <w:fldChar w:fldCharType="begin"/>
-            </w:r>
-            <w:r>
-              <w:rPr>
-                <w:noProof/>
-              </w:rPr>
               <w:instrText xml:space="preserve"> PAGEREF _Toc224758590 \h </w:instrText>
-            </w:r>
-            <w:r>
-              <w:rPr>
-                <w:noProof/>
-              </w:rPr>
-            </w:r>
-            <w:r>
-              <w:rPr>
-                <w:noProof/>
-              </w:rPr>
               <w:fldChar w:fldCharType="separate"/>
-            </w:r>
-            <w:r>
-              <w:rPr>
-                <w:noProof/>
-              </w:rPr>
               <w:t>8</w:t>
-            </w:r>
-            <w:r>
-              <w:rPr>
-                <w:noProof/>
-              </w:rPr>
               <w:fldChar w:fldCharType="end"/>
             </w:r>
           </w:hyperlink>
@@ -1191,40 +713,10 @@
                 <w:noProof/>
               </w:rPr>
               <w:tab/>
-            </w:r>
-            <w:r>
-              <w:rPr>
-                <w:noProof/>
-              </w:rPr>
               <w:fldChar w:fldCharType="begin"/>
-            </w:r>
-            <w:r>
-              <w:rPr>
-                <w:noProof/>
-              </w:rPr>
               <w:instrText xml:space="preserve"> PAGEREF _Toc224758591 \h </w:instrText>
-            </w:r>
-            <w:r>
-              <w:rPr>
-                <w:noProof/>
-              </w:rPr>
-            </w:r>
-            <w:r>
-              <w:rPr>
-                <w:noProof/>
-              </w:rPr>
               <w:fldChar w:fldCharType="separate"/>
-            </w:r>
-            <w:r>
-              <w:rPr>
-                <w:noProof/>
-              </w:rPr>
               <w:t>9</w:t>
-            </w:r>
-            <w:r>
-              <w:rPr>
-                <w:noProof/>
-              </w:rPr>
               <w:fldChar w:fldCharType="end"/>
             </w:r>
           </w:hyperlink>
@@ -1252,40 +744,10 @@
                 <w:noProof/>
               </w:rPr>
               <w:tab/>
-            </w:r>
-            <w:r>
-              <w:rPr>
-                <w:noProof/>
-              </w:rPr>
               <w:fldChar w:fldCharType="begin"/>
-            </w:r>
-            <w:r>
-              <w:rPr>
-                <w:noProof/>
-              </w:rPr>
               <w:instrText xml:space="preserve"> PAGEREF _Toc224758592 \h </w:instrText>
-            </w:r>
-            <w:r>
-              <w:rPr>
-                <w:noProof/>
-              </w:rPr>
-            </w:r>
-            <w:r>
-              <w:rPr>
-                <w:noProof/>
-              </w:rPr>
               <w:fldChar w:fldCharType="separate"/>
-            </w:r>
-            <w:r>
-              <w:rPr>
-                <w:noProof/>
-              </w:rPr>
               <w:t>9</w:t>
-            </w:r>
-            <w:r>
-              <w:rPr>
-                <w:noProof/>
-              </w:rPr>
               <w:fldChar w:fldCharType="end"/>
             </w:r>
           </w:hyperlink>
@@ -1313,40 +775,10 @@
                 <w:noProof/>
               </w:rPr>
               <w:tab/>
-            </w:r>
-            <w:r>
-              <w:rPr>
-                <w:noProof/>
-              </w:rPr>
               <w:fldChar w:fldCharType="begin"/>
-            </w:r>
-            <w:r>
-              <w:rPr>
-                <w:noProof/>
-              </w:rPr>
               <w:instrText xml:space="preserve"> PAGEREF _Toc224758593 \h </w:instrText>
-            </w:r>
-            <w:r>
-              <w:rPr>
-                <w:noProof/>
-              </w:rPr>
-            </w:r>
-            <w:r>
-              <w:rPr>
-                <w:noProof/>
-              </w:rPr>
               <w:fldChar w:fldCharType="separate"/>
-            </w:r>
-            <w:r>
-              <w:rPr>
-                <w:noProof/>
-              </w:rPr>
               <w:t>9</w:t>
-            </w:r>
-            <w:r>
-              <w:rPr>
-                <w:noProof/>
-              </w:rPr>
               <w:fldChar w:fldCharType="end"/>
             </w:r>
           </w:hyperlink>
@@ -1374,40 +806,10 @@
                 <w:noProof/>
               </w:rPr>
               <w:tab/>
-            </w:r>
-            <w:r>
-              <w:rPr>
-                <w:noProof/>
-              </w:rPr>
               <w:fldChar w:fldCharType="begin"/>
-            </w:r>
-            <w:r>
-              <w:rPr>
-                <w:noProof/>
-              </w:rPr>
               <w:instrText xml:space="preserve"> PAGEREF _Toc224758594 \h </w:instrText>
-            </w:r>
-            <w:r>
-              <w:rPr>
-                <w:noProof/>
-              </w:rPr>
-            </w:r>
-            <w:r>
-              <w:rPr>
-                <w:noProof/>
-              </w:rPr>
               <w:fldChar w:fldCharType="separate"/>
-            </w:r>
-            <w:r>
-              <w:rPr>
-                <w:noProof/>
-              </w:rPr>
               <w:t>9</w:t>
-            </w:r>
-            <w:r>
-              <w:rPr>
-                <w:noProof/>
-              </w:rPr>
               <w:fldChar w:fldCharType="end"/>
             </w:r>
           </w:hyperlink>
@@ -1435,40 +837,10 @@
                 <w:noProof/>
               </w:rPr>
               <w:tab/>
-            </w:r>
-            <w:r>
-              <w:rPr>
-                <w:noProof/>
-              </w:rPr>
               <w:fldChar w:fldCharType="begin"/>
-            </w:r>
-            <w:r>
-              <w:rPr>
-                <w:noProof/>
-              </w:rPr>
               <w:instrText xml:space="preserve"> PAGEREF _Toc224758595 \h </w:instrText>
-            </w:r>
-            <w:r>
-              <w:rPr>
-                <w:noProof/>
-              </w:rPr>
-            </w:r>
-            <w:r>
-              <w:rPr>
-                <w:noProof/>
-              </w:rPr>
               <w:fldChar w:fldCharType="separate"/>
-            </w:r>
-            <w:r>
-              <w:rPr>
-                <w:noProof/>
-              </w:rPr>
               <w:t>11</w:t>
-            </w:r>
-            <w:r>
-              <w:rPr>
-                <w:noProof/>
-              </w:rPr>
               <w:fldChar w:fldCharType="end"/>
             </w:r>
           </w:hyperlink>
@@ -1496,40 +868,10 @@
                 <w:noProof/>
               </w:rPr>
               <w:tab/>
-            </w:r>
-            <w:r>
-              <w:rPr>
-                <w:noProof/>
-              </w:rPr>
               <w:fldChar w:fldCharType="begin"/>
-            </w:r>
-            <w:r>
-              <w:rPr>
-                <w:noProof/>
-              </w:rPr>
               <w:instrText xml:space="preserve"> PAGEREF _Toc224758596 \h </w:instrText>
-            </w:r>
-            <w:r>
-              <w:rPr>
-                <w:noProof/>
-              </w:rPr>
-            </w:r>
-            <w:r>
-              <w:rPr>
-                <w:noProof/>
-              </w:rPr>
               <w:fldChar w:fldCharType="separate"/>
-            </w:r>
-            <w:r>
-              <w:rPr>
-                <w:noProof/>
-              </w:rPr>
               <w:t>11</w:t>
-            </w:r>
-            <w:r>
-              <w:rPr>
-                <w:noProof/>
-              </w:rPr>
               <w:fldChar w:fldCharType="end"/>
             </w:r>
           </w:hyperlink>
@@ -1557,40 +899,10 @@
                 <w:noProof/>
               </w:rPr>
               <w:tab/>
-            </w:r>
-            <w:r>
-              <w:rPr>
-                <w:noProof/>
-              </w:rPr>
               <w:fldChar w:fldCharType="begin"/>
-            </w:r>
-            <w:r>
-              <w:rPr>
-                <w:noProof/>
-              </w:rPr>
               <w:instrText xml:space="preserve"> PAGEREF _Toc224758597 \h </w:instrText>
-            </w:r>
-            <w:r>
-              <w:rPr>
-                <w:noProof/>
-              </w:rPr>
-            </w:r>
-            <w:r>
-              <w:rPr>
-                <w:noProof/>
-              </w:rPr>
               <w:fldChar w:fldCharType="separate"/>
-            </w:r>
-            <w:r>
-              <w:rPr>
-                <w:noProof/>
-              </w:rPr>
               <w:t>11</w:t>
-            </w:r>
-            <w:r>
-              <w:rPr>
-                <w:noProof/>
-              </w:rPr>
               <w:fldChar w:fldCharType="end"/>
             </w:r>
           </w:hyperlink>
@@ -1618,40 +930,10 @@
                 <w:noProof/>
               </w:rPr>
               <w:tab/>
-            </w:r>
-            <w:r>
-              <w:rPr>
-                <w:noProof/>
-              </w:rPr>
               <w:fldChar w:fldCharType="begin"/>
-            </w:r>
-            <w:r>
-              <w:rPr>
-                <w:noProof/>
-              </w:rPr>
               <w:instrText xml:space="preserve"> PAGEREF _Toc224758598 \h </w:instrText>
-            </w:r>
-            <w:r>
-              <w:rPr>
-                <w:noProof/>
-              </w:rPr>
-            </w:r>
-            <w:r>
-              <w:rPr>
-                <w:noProof/>
-              </w:rPr>
               <w:fldChar w:fldCharType="separate"/>
-            </w:r>
-            <w:r>
-              <w:rPr>
-                <w:noProof/>
-              </w:rPr>
               <w:t>12</w:t>
-            </w:r>
-            <w:r>
-              <w:rPr>
-                <w:noProof/>
-              </w:rPr>
               <w:fldChar w:fldCharType="end"/>
             </w:r>
           </w:hyperlink>
@@ -1679,40 +961,10 @@
                 <w:noProof/>
               </w:rPr>
               <w:tab/>
-            </w:r>
-            <w:r>
-              <w:rPr>
-                <w:noProof/>
-              </w:rPr>
               <w:fldChar w:fldCharType="begin"/>
-            </w:r>
-            <w:r>
-              <w:rPr>
-                <w:noProof/>
-              </w:rPr>
               <w:instrText xml:space="preserve"> PAGEREF _Toc224758599 \h </w:instrText>
-            </w:r>
-            <w:r>
-              <w:rPr>
-                <w:noProof/>
-              </w:rPr>
-            </w:r>
-            <w:r>
-              <w:rPr>
-                <w:noProof/>
-              </w:rPr>
               <w:fldChar w:fldCharType="separate"/>
-            </w:r>
-            <w:r>
-              <w:rPr>
-                <w:noProof/>
-              </w:rPr>
               <w:t>12</w:t>
-            </w:r>
-            <w:r>
-              <w:rPr>
-                <w:noProof/>
-              </w:rPr>
               <w:fldChar w:fldCharType="end"/>
             </w:r>
           </w:hyperlink>
@@ -1740,40 +992,10 @@
                 <w:noProof/>
               </w:rPr>
               <w:tab/>
-            </w:r>
-            <w:r>
-              <w:rPr>
-                <w:noProof/>
-              </w:rPr>
               <w:fldChar w:fldCharType="begin"/>
-            </w:r>
-            <w:r>
-              <w:rPr>
-                <w:noProof/>
-              </w:rPr>
               <w:instrText xml:space="preserve"> PAGEREF _Toc224758600 \h </w:instrText>
-            </w:r>
-            <w:r>
-              <w:rPr>
-                <w:noProof/>
-              </w:rPr>
-            </w:r>
-            <w:r>
-              <w:rPr>
-                <w:noProof/>
-              </w:rPr>
               <w:fldChar w:fldCharType="separate"/>
-            </w:r>
-            <w:r>
-              <w:rPr>
-                <w:noProof/>
-              </w:rPr>
               <w:t>12</w:t>
-            </w:r>
-            <w:r>
-              <w:rPr>
-                <w:noProof/>
-              </w:rPr>
               <w:fldChar w:fldCharType="end"/>
             </w:r>
           </w:hyperlink>
@@ -1801,40 +1023,10 @@
                 <w:noProof/>
               </w:rPr>
               <w:tab/>
-            </w:r>
-            <w:r>
-              <w:rPr>
-                <w:noProof/>
-              </w:rPr>
               <w:fldChar w:fldCharType="begin"/>
-            </w:r>
-            <w:r>
-              <w:rPr>
-                <w:noProof/>
-              </w:rPr>
               <w:instrText xml:space="preserve"> PAGEREF _Toc224758601 \h </w:instrText>
-            </w:r>
-            <w:r>
-              <w:rPr>
-                <w:noProof/>
-              </w:rPr>
-            </w:r>
-            <w:r>
-              <w:rPr>
-                <w:noProof/>
-              </w:rPr>
               <w:fldChar w:fldCharType="separate"/>
-            </w:r>
-            <w:r>
-              <w:rPr>
-                <w:noProof/>
-              </w:rPr>
               <w:t>13</w:t>
-            </w:r>
-            <w:r>
-              <w:rPr>
-                <w:noProof/>
-              </w:rPr>
               <w:fldChar w:fldCharType="end"/>
             </w:r>
           </w:hyperlink>
@@ -1862,40 +1054,10 @@
                 <w:noProof/>
               </w:rPr>
               <w:tab/>
-            </w:r>
-            <w:r>
-              <w:rPr>
-                <w:noProof/>
-              </w:rPr>
               <w:fldChar w:fldCharType="begin"/>
-            </w:r>
-            <w:r>
-              <w:rPr>
-                <w:noProof/>
-              </w:rPr>
               <w:instrText xml:space="preserve"> PAGEREF _Toc224758602 \h </w:instrText>
-            </w:r>
-            <w:r>
-              <w:rPr>
-                <w:noProof/>
-              </w:rPr>
-            </w:r>
-            <w:r>
-              <w:rPr>
-                <w:noProof/>
-              </w:rPr>
               <w:fldChar w:fldCharType="separate"/>
-            </w:r>
-            <w:r>
-              <w:rPr>
-                <w:noProof/>
-              </w:rPr>
               <w:t>14</w:t>
-            </w:r>
-            <w:r>
-              <w:rPr>
-                <w:noProof/>
-              </w:rPr>
               <w:fldChar w:fldCharType="end"/>
             </w:r>
           </w:hyperlink>
@@ -1923,40 +1085,10 @@
                 <w:noProof/>
               </w:rPr>
               <w:tab/>
-            </w:r>
-            <w:r>
-              <w:rPr>
-                <w:noProof/>
-              </w:rPr>
               <w:fldChar w:fldCharType="begin"/>
-            </w:r>
-            <w:r>
-              <w:rPr>
-                <w:noProof/>
-              </w:rPr>
               <w:instrText xml:space="preserve"> PAGEREF _Toc224758603 \h </w:instrText>
-            </w:r>
-            <w:r>
-              <w:rPr>
-                <w:noProof/>
-              </w:rPr>
-            </w:r>
-            <w:r>
-              <w:rPr>
-                <w:noProof/>
-              </w:rPr>
               <w:fldChar w:fldCharType="separate"/>
-            </w:r>
-            <w:r>
-              <w:rPr>
-                <w:noProof/>
-              </w:rPr>
               <w:t>14</w:t>
-            </w:r>
-            <w:r>
-              <w:rPr>
-                <w:noProof/>
-              </w:rPr>
               <w:fldChar w:fldCharType="end"/>
             </w:r>
           </w:hyperlink>
@@ -1984,40 +1116,10 @@
                 <w:noProof/>
               </w:rPr>
               <w:tab/>
-            </w:r>
-            <w:r>
-              <w:rPr>
-                <w:noProof/>
-              </w:rPr>
               <w:fldChar w:fldCharType="begin"/>
-            </w:r>
-            <w:r>
-              <w:rPr>
-                <w:noProof/>
-              </w:rPr>
               <w:instrText xml:space="preserve"> PAGEREF _Toc224758604 \h </w:instrText>
-            </w:r>
-            <w:r>
-              <w:rPr>
-                <w:noProof/>
-              </w:rPr>
-            </w:r>
-            <w:r>
-              <w:rPr>
-                <w:noProof/>
-              </w:rPr>
               <w:fldChar w:fldCharType="separate"/>
-            </w:r>
-            <w:r>
-              <w:rPr>
-                <w:noProof/>
-              </w:rPr>
               <w:t>14</w:t>
-            </w:r>
-            <w:r>
-              <w:rPr>
-                <w:noProof/>
-              </w:rPr>
               <w:fldChar w:fldCharType="end"/>
             </w:r>
           </w:hyperlink>
@@ -2045,40 +1147,10 @@
                 <w:noProof/>
               </w:rPr>
               <w:tab/>
-            </w:r>
-            <w:r>
-              <w:rPr>
-                <w:noProof/>
-              </w:rPr>
               <w:fldChar w:fldCharType="begin"/>
-            </w:r>
-            <w:r>
-              <w:rPr>
-                <w:noProof/>
-              </w:rPr>
               <w:instrText xml:space="preserve"> PAGEREF _Toc224758605 \h </w:instrText>
-            </w:r>
-            <w:r>
-              <w:rPr>
-                <w:noProof/>
-              </w:rPr>
-            </w:r>
-            <w:r>
-              <w:rPr>
-                <w:noProof/>
-              </w:rPr>
               <w:fldChar w:fldCharType="separate"/>
-            </w:r>
-            <w:r>
-              <w:rPr>
-                <w:noProof/>
-              </w:rPr>
               <w:t>15</w:t>
-            </w:r>
-            <w:r>
-              <w:rPr>
-                <w:noProof/>
-              </w:rPr>
               <w:fldChar w:fldCharType="end"/>
             </w:r>
           </w:hyperlink>
@@ -2106,40 +1178,10 @@
                 <w:noProof/>
               </w:rPr>
               <w:tab/>
-            </w:r>
-            <w:r>
-              <w:rPr>
-                <w:noProof/>
-              </w:rPr>
               <w:fldChar w:fldCharType="begin"/>
-            </w:r>
-            <w:r>
-              <w:rPr>
-                <w:noProof/>
-              </w:rPr>
               <w:instrText xml:space="preserve"> PAGEREF _Toc224758606 \h </w:instrText>
-            </w:r>
-            <w:r>
-              <w:rPr>
-                <w:noProof/>
-              </w:rPr>
-            </w:r>
-            <w:r>
-              <w:rPr>
-                <w:noProof/>
-              </w:rPr>
               <w:fldChar w:fldCharType="separate"/>
-            </w:r>
-            <w:r>
-              <w:rPr>
-                <w:noProof/>
-              </w:rPr>
               <w:t>15</w:t>
-            </w:r>
-            <w:r>
-              <w:rPr>
-                <w:noProof/>
-              </w:rPr>
               <w:fldChar w:fldCharType="end"/>
             </w:r>
           </w:hyperlink>
@@ -2167,40 +1209,10 @@
                 <w:noProof/>
               </w:rPr>
               <w:tab/>
-            </w:r>
-            <w:r>
-              <w:rPr>
-                <w:noProof/>
-              </w:rPr>
               <w:fldChar w:fldCharType="begin"/>
-            </w:r>
-            <w:r>
-              <w:rPr>
-                <w:noProof/>
-              </w:rPr>
               <w:instrText xml:space="preserve"> PAGEREF _Toc224758607 \h </w:instrText>
-            </w:r>
-            <w:r>
-              <w:rPr>
-                <w:noProof/>
-              </w:rPr>
-            </w:r>
-            <w:r>
-              <w:rPr>
-                <w:noProof/>
-              </w:rPr>
               <w:fldChar w:fldCharType="separate"/>
-            </w:r>
-            <w:r>
-              <w:rPr>
-                <w:noProof/>
-              </w:rPr>
               <w:t>17</w:t>
-            </w:r>
-            <w:r>
-              <w:rPr>
-                <w:noProof/>
-              </w:rPr>
               <w:fldChar w:fldCharType="end"/>
             </w:r>
           </w:hyperlink>
@@ -2228,40 +1240,10 @@
                 <w:noProof/>
               </w:rPr>
               <w:tab/>
-            </w:r>
-            <w:r>
-              <w:rPr>
-                <w:noProof/>
-              </w:rPr>
               <w:fldChar w:fldCharType="begin"/>
-            </w:r>
-            <w:r>
-              <w:rPr>
-                <w:noProof/>
-              </w:rPr>
               <w:instrText xml:space="preserve"> PAGEREF _Toc224758608 \h </w:instrText>
-            </w:r>
-            <w:r>
-              <w:rPr>
-                <w:noProof/>
-              </w:rPr>
-            </w:r>
-            <w:r>
-              <w:rPr>
-                <w:noProof/>
-              </w:rPr>
               <w:fldChar w:fldCharType="separate"/>
-            </w:r>
-            <w:r>
-              <w:rPr>
-                <w:noProof/>
-              </w:rPr>
               <w:t>17</w:t>
-            </w:r>
-            <w:r>
-              <w:rPr>
-                <w:noProof/>
-              </w:rPr>
               <w:fldChar w:fldCharType="end"/>
             </w:r>
           </w:hyperlink>
@@ -2289,40 +1271,10 @@
                 <w:noProof/>
               </w:rPr>
               <w:tab/>
-            </w:r>
-            <w:r>
-              <w:rPr>
-                <w:noProof/>
-              </w:rPr>
               <w:fldChar w:fldCharType="begin"/>
-            </w:r>
-            <w:r>
-              <w:rPr>
-                <w:noProof/>
-              </w:rPr>
               <w:instrText xml:space="preserve"> PAGEREF _Toc224758609 \h </w:instrText>
-            </w:r>
-            <w:r>
-              <w:rPr>
-                <w:noProof/>
-              </w:rPr>
-            </w:r>
-            <w:r>
-              <w:rPr>
-                <w:noProof/>
-              </w:rPr>
               <w:fldChar w:fldCharType="separate"/>
-            </w:r>
-            <w:r>
-              <w:rPr>
-                <w:noProof/>
-              </w:rPr>
               <w:t>17</w:t>
-            </w:r>
-            <w:r>
-              <w:rPr>
-                <w:noProof/>
-              </w:rPr>
               <w:fldChar w:fldCharType="end"/>
             </w:r>
           </w:hyperlink>
@@ -2350,40 +1302,10 @@
                 <w:noProof/>
               </w:rPr>
               <w:tab/>
-            </w:r>
-            <w:r>
-              <w:rPr>
-                <w:noProof/>
-              </w:rPr>
               <w:fldChar w:fldCharType="begin"/>
-            </w:r>
-            <w:r>
-              <w:rPr>
-                <w:noProof/>
-              </w:rPr>
               <w:instrText xml:space="preserve"> PAGEREF _Toc224758610 \h </w:instrText>
-            </w:r>
-            <w:r>
-              <w:rPr>
-                <w:noProof/>
-              </w:rPr>
-            </w:r>
-            <w:r>
-              <w:rPr>
-                <w:noProof/>
-              </w:rPr>
               <w:fldChar w:fldCharType="separate"/>
-            </w:r>
-            <w:r>
-              <w:rPr>
-                <w:noProof/>
-              </w:rPr>
               <w:t>17</w:t>
-            </w:r>
-            <w:r>
-              <w:rPr>
-                <w:noProof/>
-              </w:rPr>
               <w:fldChar w:fldCharType="end"/>
             </w:r>
           </w:hyperlink>
@@ -2411,40 +1333,10 @@
                 <w:noProof/>
               </w:rPr>
               <w:tab/>
-            </w:r>
-            <w:r>
-              <w:rPr>
-                <w:noProof/>
-              </w:rPr>
               <w:fldChar w:fldCharType="begin"/>
-            </w:r>
-            <w:r>
-              <w:rPr>
-                <w:noProof/>
-              </w:rPr>
               <w:instrText xml:space="preserve"> PAGEREF _Toc224758611 \h </w:instrText>
-            </w:r>
-            <w:r>
-              <w:rPr>
-                <w:noProof/>
-              </w:rPr>
-            </w:r>
-            <w:r>
-              <w:rPr>
-                <w:noProof/>
-              </w:rPr>
               <w:fldChar w:fldCharType="separate"/>
-            </w:r>
-            <w:r>
-              <w:rPr>
-                <w:noProof/>
-              </w:rPr>
               <w:t>17</w:t>
-            </w:r>
-            <w:r>
-              <w:rPr>
-                <w:noProof/>
-              </w:rPr>
               <w:fldChar w:fldCharType="end"/>
             </w:r>
           </w:hyperlink>
@@ -2472,40 +1364,10 @@
                 <w:noProof/>
               </w:rPr>
               <w:tab/>
-            </w:r>
-            <w:r>
-              <w:rPr>
-                <w:noProof/>
-              </w:rPr>
               <w:fldChar w:fldCharType="begin"/>
-            </w:r>
-            <w:r>
-              <w:rPr>
-                <w:noProof/>
-              </w:rPr>
               <w:instrText xml:space="preserve"> PAGEREF _Toc224758612 \h </w:instrText>
-            </w:r>
-            <w:r>
-              <w:rPr>
-                <w:noProof/>
-              </w:rPr>
-            </w:r>
-            <w:r>
-              <w:rPr>
-                <w:noProof/>
-              </w:rPr>
               <w:fldChar w:fldCharType="separate"/>
-            </w:r>
-            <w:r>
-              <w:rPr>
-                <w:noProof/>
-              </w:rPr>
               <w:t>19</w:t>
-            </w:r>
-            <w:r>
-              <w:rPr>
-                <w:noProof/>
-              </w:rPr>
               <w:fldChar w:fldCharType="end"/>
             </w:r>
           </w:hyperlink>
@@ -2533,40 +1395,10 @@
                 <w:noProof/>
               </w:rPr>
               <w:tab/>
-            </w:r>
-            <w:r>
-              <w:rPr>
-                <w:noProof/>
-              </w:rPr>
               <w:fldChar w:fldCharType="begin"/>
-            </w:r>
-            <w:r>
-              <w:rPr>
-                <w:noProof/>
-              </w:rPr>
               <w:instrText xml:space="preserve"> PAGEREF _Toc224758613 \h </w:instrText>
-            </w:r>
-            <w:r>
-              <w:rPr>
-                <w:noProof/>
-              </w:rPr>
-            </w:r>
-            <w:r>
-              <w:rPr>
-                <w:noProof/>
-              </w:rPr>
               <w:fldChar w:fldCharType="separate"/>
-            </w:r>
-            <w:r>
-              <w:rPr>
-                <w:noProof/>
-              </w:rPr>
               <w:t>19</w:t>
-            </w:r>
-            <w:r>
-              <w:rPr>
-                <w:noProof/>
-              </w:rPr>
               <w:fldChar w:fldCharType="end"/>
             </w:r>
           </w:hyperlink>
@@ -2594,40 +1426,10 @@
                 <w:noProof/>
               </w:rPr>
               <w:tab/>
-            </w:r>
-            <w:r>
-              <w:rPr>
-                <w:noProof/>
-              </w:rPr>
               <w:fldChar w:fldCharType="begin"/>
-            </w:r>
-            <w:r>
-              <w:rPr>
-                <w:noProof/>
-              </w:rPr>
               <w:instrText xml:space="preserve"> PAGEREF _Toc224758614 \h </w:instrText>
-            </w:r>
-            <w:r>
-              <w:rPr>
-                <w:noProof/>
-              </w:rPr>
-            </w:r>
-            <w:r>
-              <w:rPr>
-                <w:noProof/>
-              </w:rPr>
               <w:fldChar w:fldCharType="separate"/>
-            </w:r>
-            <w:r>
-              <w:rPr>
-                <w:noProof/>
-              </w:rPr>
               <w:t>19</w:t>
-            </w:r>
-            <w:r>
-              <w:rPr>
-                <w:noProof/>
-              </w:rPr>
               <w:fldChar w:fldCharType="end"/>
             </w:r>
           </w:hyperlink>
@@ -2655,40 +1457,10 @@
                 <w:noProof/>
               </w:rPr>
               <w:tab/>
-            </w:r>
-            <w:r>
-              <w:rPr>
-                <w:noProof/>
-              </w:rPr>
               <w:fldChar w:fldCharType="begin"/>
-            </w:r>
-            <w:r>
-              <w:rPr>
-                <w:noProof/>
-              </w:rPr>
               <w:instrText xml:space="preserve"> PAGEREF _Toc224758615 \h </w:instrText>
-            </w:r>
-            <w:r>
-              <w:rPr>
-                <w:noProof/>
-              </w:rPr>
-            </w:r>
-            <w:r>
-              <w:rPr>
-                <w:noProof/>
-              </w:rPr>
               <w:fldChar w:fldCharType="separate"/>
-            </w:r>
-            <w:r>
-              <w:rPr>
-                <w:noProof/>
-              </w:rPr>
               <w:t>19</w:t>
-            </w:r>
-            <w:r>
-              <w:rPr>
-                <w:noProof/>
-              </w:rPr>
               <w:fldChar w:fldCharType="end"/>
             </w:r>
           </w:hyperlink>
@@ -2716,40 +1488,10 @@
                 <w:noProof/>
               </w:rPr>
               <w:tab/>
-            </w:r>
-            <w:r>
-              <w:rPr>
-                <w:noProof/>
-              </w:rPr>
               <w:fldChar w:fldCharType="begin"/>
-            </w:r>
-            <w:r>
-              <w:rPr>
-                <w:noProof/>
-              </w:rPr>
               <w:instrText xml:space="preserve"> PAGEREF _Toc224758616 \h </w:instrText>
-            </w:r>
-            <w:r>
-              <w:rPr>
-                <w:noProof/>
-              </w:rPr>
-            </w:r>
-            <w:r>
-              <w:rPr>
-                <w:noProof/>
-              </w:rPr>
               <w:fldChar w:fldCharType="separate"/>
-            </w:r>
-            <w:r>
-              <w:rPr>
-                <w:noProof/>
-              </w:rPr>
               <w:t>19</w:t>
-            </w:r>
-            <w:r>
-              <w:rPr>
-                <w:noProof/>
-              </w:rPr>
               <w:fldChar w:fldCharType="end"/>
             </w:r>
           </w:hyperlink>
@@ -2777,40 +1519,10 @@
                 <w:noProof/>
               </w:rPr>
               <w:tab/>
-            </w:r>
-            <w:r>
-              <w:rPr>
-                <w:noProof/>
-              </w:rPr>
               <w:fldChar w:fldCharType="begin"/>
-            </w:r>
-            <w:r>
-              <w:rPr>
-                <w:noProof/>
-              </w:rPr>
               <w:instrText xml:space="preserve"> PAGEREF _Toc224758617 \h </w:instrText>
-            </w:r>
-            <w:r>
-              <w:rPr>
-                <w:noProof/>
-              </w:rPr>
-            </w:r>
-            <w:r>
-              <w:rPr>
-                <w:noProof/>
-              </w:rPr>
               <w:fldChar w:fldCharType="separate"/>
-            </w:r>
-            <w:r>
-              <w:rPr>
-                <w:noProof/>
-              </w:rPr>
               <w:t>20</w:t>
-            </w:r>
-            <w:r>
-              <w:rPr>
-                <w:noProof/>
-              </w:rPr>
               <w:fldChar w:fldCharType="end"/>
             </w:r>
           </w:hyperlink>
@@ -2838,40 +1550,10 @@
                 <w:noProof/>
               </w:rPr>
               <w:tab/>
-            </w:r>
-            <w:r>
-              <w:rPr>
-                <w:noProof/>
-              </w:rPr>
               <w:fldChar w:fldCharType="begin"/>
-            </w:r>
-            <w:r>
-              <w:rPr>
-                <w:noProof/>
-              </w:rPr>
               <w:instrText xml:space="preserve"> PAGEREF _Toc224758618 \h </w:instrText>
-            </w:r>
-            <w:r>
-              <w:rPr>
-                <w:noProof/>
-              </w:rPr>
-            </w:r>
-            <w:r>
-              <w:rPr>
-                <w:noProof/>
-              </w:rPr>
               <w:fldChar w:fldCharType="separate"/>
-            </w:r>
-            <w:r>
-              <w:rPr>
-                <w:noProof/>
-              </w:rPr>
               <w:t>20</w:t>
-            </w:r>
-            <w:r>
-              <w:rPr>
-                <w:noProof/>
-              </w:rPr>
               <w:fldChar w:fldCharType="end"/>
             </w:r>
           </w:hyperlink>
@@ -2899,40 +1581,10 @@
                 <w:noProof/>
               </w:rPr>
               <w:tab/>
-            </w:r>
-            <w:r>
-              <w:rPr>
-                <w:noProof/>
-              </w:rPr>
               <w:fldChar w:fldCharType="begin"/>
-            </w:r>
-            <w:r>
-              <w:rPr>
-                <w:noProof/>
-              </w:rPr>
               <w:instrText xml:space="preserve"> PAGEREF _Toc224758619 \h </w:instrText>
-            </w:r>
-            <w:r>
-              <w:rPr>
-                <w:noProof/>
-              </w:rPr>
-            </w:r>
-            <w:r>
-              <w:rPr>
-                <w:noProof/>
-              </w:rPr>
               <w:fldChar w:fldCharType="separate"/>
-            </w:r>
-            <w:r>
-              <w:rPr>
-                <w:noProof/>
-              </w:rPr>
               <w:t>20</w:t>
-            </w:r>
-            <w:r>
-              <w:rPr>
-                <w:noProof/>
-              </w:rPr>
               <w:fldChar w:fldCharType="end"/>
             </w:r>
           </w:hyperlink>
@@ -2960,40 +1612,10 @@
                 <w:noProof/>
               </w:rPr>
               <w:tab/>
-            </w:r>
-            <w:r>
-              <w:rPr>
-                <w:noProof/>
-              </w:rPr>
               <w:fldChar w:fldCharType="begin"/>
-            </w:r>
-            <w:r>
-              <w:rPr>
-                <w:noProof/>
-              </w:rPr>
               <w:instrText xml:space="preserve"> PAGEREF _Toc224758620 \h </w:instrText>
-            </w:r>
-            <w:r>
-              <w:rPr>
-                <w:noProof/>
-              </w:rPr>
-            </w:r>
-            <w:r>
-              <w:rPr>
-                <w:noProof/>
-              </w:rPr>
               <w:fldChar w:fldCharType="separate"/>
-            </w:r>
-            <w:r>
-              <w:rPr>
-                <w:noProof/>
-              </w:rPr>
               <w:t>22</w:t>
-            </w:r>
-            <w:r>
-              <w:rPr>
-                <w:noProof/>
-              </w:rPr>
               <w:fldChar w:fldCharType="end"/>
             </w:r>
           </w:hyperlink>
@@ -3021,40 +1643,10 @@
                 <w:noProof/>
               </w:rPr>
               <w:tab/>
-            </w:r>
-            <w:r>
-              <w:rPr>
-                <w:noProof/>
-              </w:rPr>
               <w:fldChar w:fldCharType="begin"/>
-            </w:r>
-            <w:r>
-              <w:rPr>
-                <w:noProof/>
-              </w:rPr>
               <w:instrText xml:space="preserve"> PAGEREF _Toc224758621 \h </w:instrText>
-            </w:r>
-            <w:r>
-              <w:rPr>
-                <w:noProof/>
-              </w:rPr>
-            </w:r>
-            <w:r>
-              <w:rPr>
-                <w:noProof/>
-              </w:rPr>
               <w:fldChar w:fldCharType="separate"/>
-            </w:r>
-            <w:r>
-              <w:rPr>
-                <w:noProof/>
-              </w:rPr>
               <w:t>23</w:t>
-            </w:r>
-            <w:r>
-              <w:rPr>
-                <w:noProof/>
-              </w:rPr>
               <w:fldChar w:fldCharType="end"/>
             </w:r>
           </w:hyperlink>
@@ -3082,40 +1674,10 @@
                 <w:noProof/>
               </w:rPr>
               <w:tab/>
-            </w:r>
-            <w:r>
-              <w:rPr>
-                <w:noProof/>
-              </w:rPr>
               <w:fldChar w:fldCharType="begin"/>
-            </w:r>
-            <w:r>
-              <w:rPr>
-                <w:noProof/>
-              </w:rPr>
               <w:instrText xml:space="preserve"> PAGEREF _Toc224758622 \h </w:instrText>
-            </w:r>
-            <w:r>
-              <w:rPr>
-                <w:noProof/>
-              </w:rPr>
-            </w:r>
-            <w:r>
-              <w:rPr>
-                <w:noProof/>
-              </w:rPr>
               <w:fldChar w:fldCharType="separate"/>
-            </w:r>
-            <w:r>
-              <w:rPr>
-                <w:noProof/>
-              </w:rPr>
               <w:t>24</w:t>
-            </w:r>
-            <w:r>
-              <w:rPr>
-                <w:noProof/>
-              </w:rPr>
               <w:fldChar w:fldCharType="end"/>
             </w:r>
           </w:hyperlink>
@@ -3143,40 +1705,10 @@
                 <w:noProof/>
               </w:rPr>
               <w:tab/>
-            </w:r>
-            <w:r>
-              <w:rPr>
-                <w:noProof/>
-              </w:rPr>
               <w:fldChar w:fldCharType="begin"/>
-            </w:r>
-            <w:r>
-              <w:rPr>
-                <w:noProof/>
-              </w:rPr>
               <w:instrText xml:space="preserve"> PAGEREF _Toc224758623 \h </w:instrText>
-            </w:r>
-            <w:r>
-              <w:rPr>
-                <w:noProof/>
-              </w:rPr>
-            </w:r>
-            <w:r>
-              <w:rPr>
-                <w:noProof/>
-              </w:rPr>
               <w:fldChar w:fldCharType="separate"/>
-            </w:r>
-            <w:r>
-              <w:rPr>
-                <w:noProof/>
-              </w:rPr>
               <w:t>25</w:t>
-            </w:r>
-            <w:r>
-              <w:rPr>
-                <w:noProof/>
-              </w:rPr>
               <w:fldChar w:fldCharType="end"/>
             </w:r>
           </w:hyperlink>
@@ -3204,40 +1736,10 @@
                 <w:noProof/>
               </w:rPr>
               <w:tab/>
-            </w:r>
-            <w:r>
-              <w:rPr>
-                <w:noProof/>
-              </w:rPr>
               <w:fldChar w:fldCharType="begin"/>
-            </w:r>
-            <w:r>
-              <w:rPr>
-                <w:noProof/>
-              </w:rPr>
               <w:instrText xml:space="preserve"> PAGEREF _Toc224758624 \h </w:instrText>
-            </w:r>
-            <w:r>
-              <w:rPr>
-                <w:noProof/>
-              </w:rPr>
-            </w:r>
-            <w:r>
-              <w:rPr>
-                <w:noProof/>
-              </w:rPr>
               <w:fldChar w:fldCharType="separate"/>
-            </w:r>
-            <w:r>
-              <w:rPr>
-                <w:noProof/>
-              </w:rPr>
               <w:t>25</w:t>
-            </w:r>
-            <w:r>
-              <w:rPr>
-                <w:noProof/>
-              </w:rPr>
               <w:fldChar w:fldCharType="end"/>
             </w:r>
           </w:hyperlink>
@@ -3265,40 +1767,10 @@
                 <w:noProof/>
               </w:rPr>
               <w:tab/>
-            </w:r>
-            <w:r>
-              <w:rPr>
-                <w:noProof/>
-              </w:rPr>
               <w:fldChar w:fldCharType="begin"/>
-            </w:r>
-            <w:r>
-              <w:rPr>
-                <w:noProof/>
-              </w:rPr>
               <w:instrText xml:space="preserve"> PAGEREF _Toc224758625 \h </w:instrText>
-            </w:r>
-            <w:r>
-              <w:rPr>
-                <w:noProof/>
-              </w:rPr>
-            </w:r>
-            <w:r>
-              <w:rPr>
-                <w:noProof/>
-              </w:rPr>
               <w:fldChar w:fldCharType="separate"/>
-            </w:r>
-            <w:r>
-              <w:rPr>
-                <w:noProof/>
-              </w:rPr>
               <w:t>25</w:t>
-            </w:r>
-            <w:r>
-              <w:rPr>
-                <w:noProof/>
-              </w:rPr>
               <w:fldChar w:fldCharType="end"/>
             </w:r>
           </w:hyperlink>
@@ -3326,40 +1798,10 @@
                 <w:noProof/>
               </w:rPr>
               <w:tab/>
-            </w:r>
-            <w:r>
-              <w:rPr>
-                <w:noProof/>
-              </w:rPr>
               <w:fldChar w:fldCharType="begin"/>
-            </w:r>
-            <w:r>
-              <w:rPr>
-                <w:noProof/>
-              </w:rPr>
               <w:instrText xml:space="preserve"> PAGEREF _Toc224758626 \h </w:instrText>
-            </w:r>
-            <w:r>
-              <w:rPr>
-                <w:noProof/>
-              </w:rPr>
-            </w:r>
-            <w:r>
-              <w:rPr>
-                <w:noProof/>
-              </w:rPr>
               <w:fldChar w:fldCharType="separate"/>
-            </w:r>
-            <w:r>
-              <w:rPr>
-                <w:noProof/>
-              </w:rPr>
               <w:t>25</w:t>
-            </w:r>
-            <w:r>
-              <w:rPr>
-                <w:noProof/>
-              </w:rPr>
               <w:fldChar w:fldCharType="end"/>
             </w:r>
           </w:hyperlink>
@@ -3387,40 +1829,10 @@
                 <w:noProof/>
               </w:rPr>
               <w:tab/>
-            </w:r>
-            <w:r>
-              <w:rPr>
-                <w:noProof/>
-              </w:rPr>
               <w:fldChar w:fldCharType="begin"/>
-            </w:r>
-            <w:r>
-              <w:rPr>
-                <w:noProof/>
-              </w:rPr>
               <w:instrText xml:space="preserve"> PAGEREF _Toc224758627 \h </w:instrText>
-            </w:r>
-            <w:r>
-              <w:rPr>
-                <w:noProof/>
-              </w:rPr>
-            </w:r>
-            <w:r>
-              <w:rPr>
-                <w:noProof/>
-              </w:rPr>
               <w:fldChar w:fldCharType="separate"/>
-            </w:r>
-            <w:r>
-              <w:rPr>
-                <w:noProof/>
-              </w:rPr>
               <w:t>25</w:t>
-            </w:r>
-            <w:r>
-              <w:rPr>
-                <w:noProof/>
-              </w:rPr>
               <w:fldChar w:fldCharType="end"/>
             </w:r>
           </w:hyperlink>
@@ -3448,40 +1860,10 @@
                 <w:noProof/>
               </w:rPr>
               <w:tab/>
-            </w:r>
-            <w:r>
-              <w:rPr>
-                <w:noProof/>
-              </w:rPr>
               <w:fldChar w:fldCharType="begin"/>
-            </w:r>
-            <w:r>
-              <w:rPr>
-                <w:noProof/>
-              </w:rPr>
               <w:instrText xml:space="preserve"> PAGEREF _Toc224758628 \h </w:instrText>
-            </w:r>
-            <w:r>
-              <w:rPr>
-                <w:noProof/>
-              </w:rPr>
-            </w:r>
-            <w:r>
-              <w:rPr>
-                <w:noProof/>
-              </w:rPr>
               <w:fldChar w:fldCharType="separate"/>
-            </w:r>
-            <w:r>
-              <w:rPr>
-                <w:noProof/>
-              </w:rPr>
               <w:t>26</w:t>
-            </w:r>
-            <w:r>
-              <w:rPr>
-                <w:noProof/>
-              </w:rPr>
               <w:fldChar w:fldCharType="end"/>
             </w:r>
           </w:hyperlink>
@@ -3536,13 +1918,7 @@
         <w:spacing w:after="120" w:line="276" w:lineRule="auto"/>
       </w:pPr>
       <w:r>
-        <w:t>Consumer drones are everywhere now. The FAA has over 1.1 million registered as of 2025, and unauthorized flights near airports and public events keep going up. The problem is that most counter-drone systems on the market are active radar, which means they’re expensive (easily $50,000+), they need regulatory licenses to operate because they transmit RF energy, and they give away their own position. For a lot of organizations, that’s just not practical. What’s missing is a cheaper, passive approach</w:t>
-      </w:r>
-      <w:r>
-        <w:t xml:space="preserve">, </w:t>
-      </w:r>
-      <w:r>
-        <w:t>something that can pick up on drones by listening to the signals they already emit, without broadcasting anything itself.</w:t>
+        <w:t>Consumer drones are everywhere now. The FAA has over 1.1 million registered as of 2025, and unauthorized flights near airports and public events keep going up. The problem is that most counter-drone systems on the market are active radar, which means they’re expensive (easily $50,000+), they need regulatory licenses to operate because they transmit RF energy, and they give away their own position. For a lot of organizations, that’s just not practical. What’s missing is a cheaper, passive approach, something that can pick up on drones by listening to the signals they already emit, without broadcasting anything itself.</w:t>
       </w:r>
     </w:p>
     <w:p>
@@ -3560,35 +1936,7 @@
         <w:spacing w:after="120" w:line="276" w:lineRule="auto"/>
       </w:pPr>
       <w:r>
-        <w:t xml:space="preserve">The people who would </w:t>
-      </w:r>
-      <w:proofErr w:type="gramStart"/>
-      <w:r>
-        <w:t>actually use</w:t>
-      </w:r>
-      <w:proofErr w:type="gramEnd"/>
-      <w:r>
-        <w:t xml:space="preserve"> something like this are security teams</w:t>
-      </w:r>
-      <w:r>
-        <w:t xml:space="preserve">, </w:t>
-      </w:r>
-      <w:r>
-        <w:t>at airports, power plants, stadiums, or similar facilities</w:t>
-      </w:r>
-      <w:r>
-        <w:t xml:space="preserve">, </w:t>
-      </w:r>
-      <w:r>
-        <w:t xml:space="preserve">who need to know when a drone shows up in their airspace. Law enforcement has a use case too. The main requirements from their perspective are </w:t>
-      </w:r>
-      <w:proofErr w:type="gramStart"/>
-      <w:r>
-        <w:t>pretty straightforward</w:t>
-      </w:r>
-      <w:proofErr w:type="gramEnd"/>
-      <w:r>
-        <w:t>: detect drones far enough out to do something about it (we’re targeting 200+ yards), figure out what kind of drone it is if possible, and do all of this without needing an RF engineer on staff to run it.</w:t>
+        <w:t>The people who would actually use something like this are security teams, at airports, power plants, stadiums, or similar facilities, who need to know when a drone shows up in their airspace. Law enforcement has a use case too. The main requirements from their perspective are pretty straightforward: detect drones far enough out to do something about it (we’re targeting 200+ yards), figure out what kind of drone it is if possible, and do all of this without needing an RF engineer on staff to run it.</w:t>
       </w:r>
     </w:p>
     <w:p>
@@ -3606,15 +1954,7 @@
         <w:spacing w:after="120" w:line="276" w:lineRule="auto"/>
       </w:pPr>
       <w:r>
-        <w:t xml:space="preserve">Build a passive RF system that can detect consumer drones at 2.4 GHz and estimate their bearing without transmitting anything. The target specs </w:t>
-      </w:r>
-      <w:proofErr w:type="gramStart"/>
-      <w:r>
-        <w:t>are:</w:t>
-      </w:r>
-      <w:proofErr w:type="gramEnd"/>
-      <w:r>
-        <w:t xml:space="preserve"> at least 200 yards detection range in open sky, bearing accuracy within ±5° at 100 meters, fewer than one false alarm per ten minutes, and under two seconds from signal appearance to detection alert. It also needs to be buildable on a senior design budget.</w:t>
+        <w:t>Build a passive RF system that can detect consumer drones at 2.4 GHz and estimate their bearing without transmitting anything. The target specs are: at least 200 yards detection range in open sky, bearing accuracy within ±5° at 100 meters, fewer than one false alarm per ten minutes, and under two seconds from signal appearance to detection alert. It also needs to be buildable on a senior design budget.</w:t>
       </w:r>
     </w:p>
     <w:p>
@@ -3663,15 +2003,7 @@
         <w:spacing w:after="60" w:line="276" w:lineRule="auto"/>
       </w:pPr>
       <w:r>
-        <w:t xml:space="preserve">Integrate protocol-specific decoders for FAA Remote ID (ASTM F3411) and DJI </w:t>
-      </w:r>
-      <w:proofErr w:type="spellStart"/>
-      <w:r>
-        <w:t>DroneID</w:t>
-      </w:r>
-      <w:proofErr w:type="spellEnd"/>
-      <w:r>
-        <w:t xml:space="preserve"> to extract drone identity and position data.</w:t>
+        <w:t>Integrate protocol-specific decoders for FAA Remote ID (ASTM F3411) and DJI DroneID to extract drone identity and position data.</w:t>
       </w:r>
     </w:p>
     <w:p>
@@ -3731,13 +2063,7 @@
         <w:spacing w:after="120" w:line="276" w:lineRule="auto"/>
       </w:pPr>
       <w:r>
-        <w:t>At a high level, the system has two receive paths going into one SDR. The first path is an omnidirectional antenna that gives us 360-degree awareness</w:t>
-      </w:r>
-      <w:r>
-        <w:t xml:space="preserve">, </w:t>
-      </w:r>
-      <w:r>
-        <w:t>it is basically a tripwire that flags when something new shows up in the band. The second path is a Yagi directional antenna on a motorized mount, which we steer toward signals of interest for CA-CFAR detection and bearing measurement. Both feed into the B210’s two MIMO channels at 30.72 MSPS each. IQ data streams over USB 3.0 to a laptop running the Python DSP pipeline, which handles detection, classification, and antenna control commands in an async loop.</w:t>
+        <w:t>At a high level, the system has two receive paths going into one SDR. The first path is an omnidirectional antenna that gives us 360-degree awareness, it is basically a tripwire that flags when something new shows up in the band. The second path is a Yagi directional antenna on a motorized mount, which we steer toward signals of interest for CA-CFAR detection and bearing measurement. Both feed into the B210’s two MIMO channels at 30.72 MSPS each. IQ data streams over USB 3.0 to a laptop running the Python DSP pipeline, which handles detection, classification, and antenna control commands in an async loop.</w:t>
       </w:r>
     </w:p>
     <w:p>
@@ -3800,27 +2126,7 @@
           <w:sz w:val="20"/>
           <w:szCs w:val="20"/>
         </w:rPr>
-        <w:t xml:space="preserve">Figure 1: System architecture showing the </w:t>
-      </w:r>
-      <w:proofErr w:type="gramStart"/>
-      <w:r>
-        <w:rPr>
-          <w:i/>
-          <w:iCs/>
-          <w:sz w:val="20"/>
-          <w:szCs w:val="20"/>
-        </w:rPr>
-        <w:t>dual-channel</w:t>
-      </w:r>
-      <w:proofErr w:type="gramEnd"/>
-      <w:r>
-        <w:rPr>
-          <w:i/>
-          <w:iCs/>
-          <w:sz w:val="20"/>
-          <w:szCs w:val="20"/>
-        </w:rPr>
-        <w:t xml:space="preserve"> receive path from antennas through the RF front end, SDR, DSP pipeline, and user interface.</w:t>
+        <w:t>Figure 1: System architecture showing the dual-channel receive path from antennas through the RF front end, SDR, DSP pipeline, and user interface.</w:t>
       </w:r>
     </w:p>
     <w:p>
@@ -4134,23 +2440,7 @@
                 <w:sz w:val="20"/>
                 <w:szCs w:val="20"/>
               </w:rPr>
-              <w:t xml:space="preserve">DJI </w:t>
-            </w:r>
-            <w:proofErr w:type="spellStart"/>
-            <w:r>
-              <w:rPr>
-                <w:sz w:val="20"/>
-                <w:szCs w:val="20"/>
-              </w:rPr>
-              <w:t>OcuSync</w:t>
-            </w:r>
-            <w:proofErr w:type="spellEnd"/>
-            <w:r>
-              <w:rPr>
-                <w:sz w:val="20"/>
-                <w:szCs w:val="20"/>
-              </w:rPr>
-              <w:t xml:space="preserve"> 2/3</w:t>
+              <w:t>DJI OcuSync 2/3</w:t>
             </w:r>
           </w:p>
         </w:tc>
@@ -4254,23 +2544,7 @@
                 <w:sz w:val="20"/>
                 <w:szCs w:val="20"/>
               </w:rPr>
-              <w:t xml:space="preserve">OFDM, FHSS, </w:t>
-            </w:r>
-            <w:proofErr w:type="spellStart"/>
-            <w:r>
-              <w:rPr>
-                <w:sz w:val="20"/>
-                <w:szCs w:val="20"/>
-              </w:rPr>
-              <w:t>DroneID</w:t>
-            </w:r>
-            <w:proofErr w:type="spellEnd"/>
-            <w:r>
-              <w:rPr>
-                <w:sz w:val="20"/>
-                <w:szCs w:val="20"/>
-              </w:rPr>
-              <w:t xml:space="preserve"> every 600ms</w:t>
+              <w:t>OFDM, FHSS, DroneID every 600ms</w:t>
             </w:r>
           </w:p>
         </w:tc>
@@ -4300,21 +2574,12 @@
             </w:tcMar>
           </w:tcPr>
           <w:p>
-            <w:proofErr w:type="spellStart"/>
-            <w:r>
-              <w:rPr>
-                <w:sz w:val="20"/>
-                <w:szCs w:val="20"/>
-              </w:rPr>
-              <w:t>WiFi</w:t>
-            </w:r>
-            <w:proofErr w:type="spellEnd"/>
-            <w:r>
-              <w:rPr>
-                <w:sz w:val="20"/>
-                <w:szCs w:val="20"/>
-              </w:rPr>
-              <w:t xml:space="preserve"> (802.11)</w:t>
+            <w:r>
+              <w:rPr>
+                <w:sz w:val="20"/>
+                <w:szCs w:val="20"/>
+              </w:rPr>
+              <w:t>WiFi (802.11)</w:t>
             </w:r>
           </w:p>
         </w:tc>
@@ -4555,21 +2820,12 @@
             </w:tcMar>
           </w:tcPr>
           <w:p>
-            <w:proofErr w:type="spellStart"/>
-            <w:r>
-              <w:rPr>
-                <w:sz w:val="20"/>
-                <w:szCs w:val="20"/>
-              </w:rPr>
-              <w:t>WiFi</w:t>
-            </w:r>
-            <w:proofErr w:type="spellEnd"/>
-            <w:r>
-              <w:rPr>
-                <w:sz w:val="20"/>
-                <w:szCs w:val="20"/>
-              </w:rPr>
-              <w:t xml:space="preserve"> beacon, 1 sec interval</w:t>
+            <w:r>
+              <w:rPr>
+                <w:sz w:val="20"/>
+                <w:szCs w:val="20"/>
+              </w:rPr>
+              <w:t>WiFi beacon, 1 sec interval</w:t>
             </w:r>
           </w:p>
         </w:tc>
@@ -4599,7 +2855,6 @@
             </w:tcMar>
           </w:tcPr>
           <w:p>
-            <w:proofErr w:type="spellStart"/>
             <w:r>
               <w:rPr>
                 <w:sz w:val="20"/>
@@ -4607,7 +2862,6 @@
               </w:rPr>
               <w:t>ExpressLRS</w:t>
             </w:r>
-            <w:proofErr w:type="spellEnd"/>
           </w:p>
         </w:tc>
         <w:tc>
@@ -4743,21 +2997,12 @@
             </w:tcMar>
           </w:tcPr>
           <w:p>
-            <w:proofErr w:type="spellStart"/>
-            <w:r>
-              <w:rPr>
-                <w:sz w:val="20"/>
-                <w:szCs w:val="20"/>
-              </w:rPr>
-              <w:t>FrSky</w:t>
-            </w:r>
-            <w:proofErr w:type="spellEnd"/>
-            <w:r>
-              <w:rPr>
-                <w:sz w:val="20"/>
-                <w:szCs w:val="20"/>
-              </w:rPr>
-              <w:t xml:space="preserve"> ACCST</w:t>
+            <w:r>
+              <w:rPr>
+                <w:sz w:val="20"/>
+                <w:szCs w:val="20"/>
+              </w:rPr>
+              <w:t>FrSky ACCST</w:t>
             </w:r>
           </w:p>
         </w:tc>
@@ -5519,31 +3764,7 @@
         <w:spacing w:after="120" w:line="276" w:lineRule="auto"/>
       </w:pPr>
       <w:r>
-        <w:t xml:space="preserve">The antenna subsystem consists of a 12-element Yagi-Uda directional antenna (12 </w:t>
-      </w:r>
-      <w:proofErr w:type="spellStart"/>
-      <w:r>
-        <w:t>dBi</w:t>
-      </w:r>
-      <w:proofErr w:type="spellEnd"/>
-      <w:r>
-        <w:t xml:space="preserve"> gain, approximately 35° 3 dB beamwidth) mounted on the SPS-500 two-axis precision positioning system (provided by Honeywell) for 360° continuous azimuth rotation and −15° to +90° elevation, and a fixed vertical dipole omnidirectional antenna (2 </w:t>
-      </w:r>
-      <w:proofErr w:type="spellStart"/>
-      <w:r>
-        <w:t>dBi</w:t>
-      </w:r>
-      <w:proofErr w:type="spellEnd"/>
-      <w:r>
-        <w:t xml:space="preserve"> gain) for all-around presence detection. Both antennas operate at 2.4 GHz. The Yagi is currently a PCB Yagi (ASIN B0BWM9X2HJ) for testing, with a planned upgrade to the L-com HG2415Y-RSP (15 </w:t>
-      </w:r>
-      <w:proofErr w:type="spellStart"/>
-      <w:r>
-        <w:t>dBi</w:t>
-      </w:r>
-      <w:proofErr w:type="spellEnd"/>
-      <w:r>
-        <w:t>, 30° beamwidth) for the final system. The SPS-500 communicates with the host computer via RS-422 serial protocol, providing 0.01° angular resolution and real-time encoder position feedback (see Section 4.2 for details).</w:t>
+        <w:t>The antenna subsystem consists of a 12-element Yagi-Uda directional antenna (12 dBi gain, approximately 35° 3 dB beamwidth) mounted on the SPS-500 two-axis precision positioning system (provided by Honeywell) for 360° continuous azimuth rotation and −15° to +90° elevation, and a fixed vertical dipole omnidirectional antenna (2 dBi gain) for all-around presence detection. Both antennas operate at 2.4 GHz. The Yagi is currently a PCB Yagi (ASIN B0BWM9X2HJ) for testing, with a planned upgrade to the L-com HG2415Y-RSP (15 dBi, 30° beamwidth) for the final system. The SPS-500 communicates with the host computer via RS-422 serial protocol, providing 0.01° angular resolution and real-time encoder position feedback (see Section 4.2 for details).</w:t>
       </w:r>
     </w:p>
     <w:p>
@@ -5595,23 +3816,7 @@
         <w:spacing w:after="120" w:line="276" w:lineRule="auto"/>
       </w:pPr>
       <w:r>
-        <w:t xml:space="preserve">We looked at three SDR options: the Ettus USRP B210, the </w:t>
-      </w:r>
-      <w:proofErr w:type="spellStart"/>
-      <w:r>
-        <w:t>HackRF</w:t>
-      </w:r>
-      <w:proofErr w:type="spellEnd"/>
-      <w:r>
-        <w:t xml:space="preserve"> One, and the RTL-SDR V3. The big deciding factors were whether it could do dual-channel MIMO (we need two simultaneous receive paths), how much bandwidth we could capture at once (at least 20 MHz for </w:t>
-      </w:r>
-      <w:proofErr w:type="spellStart"/>
-      <w:r>
-        <w:t>WiFi</w:t>
-      </w:r>
-      <w:proofErr w:type="spellEnd"/>
-      <w:r>
-        <w:t xml:space="preserve"> signals), dynamic range (the 2.4 GHz band is crowded), and how mature the software drivers were.</w:t>
+        <w:t>We looked at three SDR options: the Ettus USRP B210, the HackRF One, and the RTL-SDR V3. The big deciding factors were whether it could do dual-channel MIMO (we need two simultaneous receive paths), how much bandwidth we could capture at once (at least 20 MHz for WiFi signals), dynamic range (the 2.4 GHz band is crowded), and how mature the software drivers were.</w:t>
       </w:r>
     </w:p>
     <w:tbl>
@@ -5753,7 +3958,6 @@
             </w:tcMar>
           </w:tcPr>
           <w:p>
-            <w:proofErr w:type="spellStart"/>
             <w:r>
               <w:rPr>
                 <w:b/>
@@ -5762,18 +3966,7 @@
                 <w:sz w:val="20"/>
                 <w:szCs w:val="20"/>
               </w:rPr>
-              <w:t>HackRF</w:t>
-            </w:r>
-            <w:proofErr w:type="spellEnd"/>
-            <w:r>
-              <w:rPr>
-                <w:b/>
-                <w:bCs/>
-                <w:color w:val="FFFFFF"/>
-                <w:sz w:val="20"/>
-                <w:szCs w:val="20"/>
-              </w:rPr>
-              <w:t xml:space="preserve"> One</w:t>
+              <w:t>HackRF One</w:t>
             </w:r>
           </w:p>
         </w:tc>
@@ -6664,15 +4857,7 @@
         <w:spacing w:after="120" w:line="276" w:lineRule="auto"/>
       </w:pPr>
       <w:r>
-        <w:t xml:space="preserve">The B210 costs more, but it was the only option that does native dual-channel MIMO, which we need for the omni-plus-Yagi approach. The </w:t>
-      </w:r>
-      <w:proofErr w:type="spellStart"/>
-      <w:r>
-        <w:t>HackRF</w:t>
-      </w:r>
-      <w:proofErr w:type="spellEnd"/>
-      <w:r>
-        <w:t xml:space="preserve"> and RTL-SDR are both single-channel, so they were ruled out early.</w:t>
+        <w:t>The B210 costs more, but it was the only option that does native dual-channel MIMO, which we need for the omni-plus-Yagi approach. The HackRF and RTL-SDR are both single-channel, so they were ruled out early.</w:t>
       </w:r>
     </w:p>
     <w:p>
@@ -6690,21 +4875,7 @@
         <w:spacing w:after="120" w:line="276" w:lineRule="auto"/>
       </w:pPr>
       <w:r>
-        <w:t>For the Yagi channel, we had to decide between a fixed threshold and CA-CFAR. A fixed threshold is simpler to implement but breaks down when the noise floor shifts</w:t>
-      </w:r>
-      <w:r>
-        <w:t xml:space="preserve">, </w:t>
-      </w:r>
-      <w:r>
-        <w:t xml:space="preserve">which happens constantly at 2.4 GHz because of </w:t>
-      </w:r>
-      <w:proofErr w:type="spellStart"/>
-      <w:r>
-        <w:t>WiFi</w:t>
-      </w:r>
-      <w:proofErr w:type="spellEnd"/>
-      <w:r>
-        <w:t xml:space="preserve"> routers and other traffic in the band. CA-CFAR estimates the local noise level and adjusts the threshold automatically, so it holds a roughly constant false alarm rate regardless of what is happening around it. We went with CA-CFAR for the Yagi. For the omni channel we kept a simpler adaptive energy detector since it only needs to flag “something appeared in the band,” not make fine-grained detections.</w:t>
+        <w:t>For the Yagi channel, we had to decide between a fixed threshold and CA-CFAR. A fixed threshold is simpler to implement but breaks down when the noise floor shifts, which happens constantly at 2.4 GHz because of WiFi routers and other traffic in the band. CA-CFAR estimates the local noise level and adjusts the threshold automatically, so it holds a roughly constant false alarm rate regardless of what is happening around it. We went with CA-CFAR for the Yagi. For the omni channel we kept a simpler adaptive energy detector since it only needs to flag “something appeared in the band,” not make fine-grained detections.</w:t>
       </w:r>
     </w:p>
     <w:p>
@@ -6722,21 +4893,7 @@
         <w:spacing w:after="120" w:line="276" w:lineRule="auto"/>
       </w:pPr>
       <w:r>
-        <w:t>For the antenna setup, we considered three options. A single omni would be the simplest but gives us no bearing at all. A phased array would let us steer electronically, but that means multiple synchronized SDR channels and a lot of calibration work</w:t>
-      </w:r>
-      <w:r>
-        <w:t xml:space="preserve">, </w:t>
-      </w:r>
-      <w:r>
-        <w:t xml:space="preserve">way beyond our budget and timeline. </w:t>
-      </w:r>
-      <w:proofErr w:type="gramStart"/>
-      <w:r>
-        <w:t>So</w:t>
-      </w:r>
-      <w:proofErr w:type="gramEnd"/>
-      <w:r>
-        <w:t xml:space="preserve"> we went with a mechanically steered Yagi plus a separate omni. The omni gives us all-around detection cueing, and the Yagi gives us the gain and directional selectivity we need for bearing estimation. It is more mechanical complexity than a phased array, but far more realistic for a senior design project.</w:t>
+        <w:t>For the antenna setup, we considered three options. A single omni would be the simplest but gives us no bearing at all. A phased array would let us steer electronically, but that means multiple synchronized SDR channels and a lot of calibration work, way beyond our budget and timeline. So we went with a mechanically steered Yagi plus a separate omni. The omni gives us all-around detection cueing, and the Yagi gives us the gain and directional selectivity we need for bearing estimation. It is more mechanical complexity than a phased array, but far more realistic for a senior design project.</w:t>
       </w:r>
     </w:p>
     <w:p>
@@ -6834,15 +4991,7 @@
         <w:spacing w:after="120" w:line="276" w:lineRule="auto"/>
       </w:pPr>
       <w:r>
-        <w:t xml:space="preserve">The DSP pipeline processes IQ samples from both receive channels through a series of stages, from raw sample ingestion through detection, classification, and bearing estimation. The pipeline operates asynchronously using Python’s </w:t>
-      </w:r>
-      <w:proofErr w:type="spellStart"/>
-      <w:r>
-        <w:t>asyncio</w:t>
-      </w:r>
-      <w:proofErr w:type="spellEnd"/>
-      <w:r>
-        <w:t xml:space="preserve"> framework, ensuring that hardware I/O does not block signal processing.</w:t>
+        <w:t>The DSP pipeline processes IQ samples from both receive channels through a series of stages, from raw sample ingestion through detection, classification, and bearing estimation. The pipeline operates asynchronously using Python’s asyncio framework, ensuring that hardware I/O does not block signal processing.</w:t>
       </w:r>
     </w:p>
     <w:p>
@@ -6923,17 +5072,7 @@
         <w:spacing w:after="120" w:line="276" w:lineRule="auto"/>
       </w:pPr>
       <w:r>
-        <w:t xml:space="preserve">Power Spectral Density is computed using Welch’s method with a 2048-point FFT, Hanning window, and 50% overlap. This yields a frequency resolution of approximately 15 kHz (30.72 MHz / 2048) and produces updated PSD estimates every ~67 </w:t>
-      </w:r>
-      <w:proofErr w:type="spellStart"/>
-      <w:r>
-        <w:t>ms.</w:t>
-      </w:r>
-      <w:proofErr w:type="spellEnd"/>
-      <w:r>
-        <w:t xml:space="preserve"> The Welch method was chosen over a single-frame </w:t>
-      </w:r>
-      <w:r>
+        <w:t xml:space="preserve">Power Spectral Density is computed using Welch’s method with a 2048-point FFT, Hanning window, and 50% overlap. This yields a frequency resolution of approximately 15 kHz (30.72 MHz / 2048) and produces updated PSD estimates every ~67 ms. The Welch method was chosen over a single-frame </w:t>
         <w:lastRenderedPageBreak/>
         <w:t>periodogram because averaging multiple overlapped segments reduces PSD variance, which is critical for reliable threshold-based detection.</w:t>
       </w:r>
@@ -6971,23 +5110,7 @@
         <w:spacing w:after="120" w:line="276" w:lineRule="auto"/>
       </w:pPr>
       <w:r>
-        <w:t xml:space="preserve">The omnidirectional channel uses an exponential moving average (EMA) noise floor estimator with a protected update rule: only frequency bins that are currently below the detection threshold contribute to the noise floor estimate. This prevents persistent strong signals (such as a nearby </w:t>
-      </w:r>
-      <w:proofErr w:type="spellStart"/>
-      <w:r>
-        <w:t>WiFi</w:t>
-      </w:r>
-      <w:proofErr w:type="spellEnd"/>
-      <w:r>
-        <w:t xml:space="preserve"> access point) from raising the noise floor and masking weaker drone signals. A duration gate requires signals to persist for a minimum of 50 </w:t>
-      </w:r>
-      <w:proofErr w:type="spellStart"/>
-      <w:r>
-        <w:t>ms</w:t>
-      </w:r>
-      <w:proofErr w:type="spellEnd"/>
-      <w:r>
-        <w:t xml:space="preserve"> across consecutive frames before triggering an alert, rejecting transient impulse noise.</w:t>
+        <w:t>The omnidirectional channel uses an exponential moving average (EMA) noise floor estimator with a protected update rule: only frequency bins that are currently below the detection threshold contribute to the noise floor estimate. This prevents persistent strong signals (such as a nearby WiFi access point) from raising the noise floor and masking weaker drone signals. A duration gate requires signals to persist for a minimum of 50 ms across consecutive frames before triggering an alert, rejecting transient impulse noise.</w:t>
       </w:r>
     </w:p>
     <w:p>
@@ -7114,15 +5237,7 @@
         <w:spacing w:after="120" w:line="276" w:lineRule="auto"/>
       </w:pPr>
       <w:r>
-        <w:t xml:space="preserve">The interface between the host control computer and the SPS-500 is implemented using the RS-422 (EIA/TIA-422) differential serial communication standard. RS-422 was selected for its noise immunity in electrically noisy environments, its support for cable runs up to 1200 meters per the EIA-422 specification, and its compatibility with the SPS-500’s native command interface. The serial link is configured at 115200 bps, 8 data bits, 1 stop bit, no parity, and no flow control. The host computer interfaces with the RS-422 link via a USB-to-RS422 converter, accessed through the </w:t>
-      </w:r>
-      <w:proofErr w:type="spellStart"/>
-      <w:r>
-        <w:t>PySerial</w:t>
-      </w:r>
-      <w:proofErr w:type="spellEnd"/>
-      <w:r>
-        <w:t xml:space="preserve"> library in Python.</w:t>
+        <w:t>The interface between the host control computer and the SPS-500 is implemented using the RS-422 (EIA/TIA-422) differential serial communication standard. RS-422 was selected for its noise immunity in electrically noisy environments, its support for cable runs up to 1200 meters per the EIA-422 specification, and its compatibility with the SPS-500’s native command interface. The serial link is configured at 115200 bps, 8 data bits, 1 stop bit, no parity, and no flow control. The host computer interfaces with the RS-422 link via a USB-to-RS422 converter, accessed through the PySerial library in Python.</w:t>
       </w:r>
     </w:p>
     <w:p>
@@ -7130,21 +5245,8 @@
         <w:spacing w:after="120" w:line="276" w:lineRule="auto"/>
       </w:pPr>
       <w:r>
-        <w:t xml:space="preserve">All command packets follow the SPS-500 manufacturer’s protocol, consisting of header bytes, a command identifier, a data payload, and a CRC-8 checksum for data integrity verification. Commands transmitted to the SPS-500 include velocity set commands (azimuth and elevation axes independently), position query commands (to retrieve current encoder angles referenced to 0° = true north for azimuth and 0° = horizontal for elevation), and system status requests. Measured command round-trip latency is less than 5 </w:t>
-      </w:r>
-      <w:proofErr w:type="spellStart"/>
-      <w:r>
-        <w:t>ms</w:t>
-      </w:r>
-      <w:proofErr w:type="spellEnd"/>
-      <w:r>
-        <w:t xml:space="preserve"> at 115200 bps, which is negligible relative to the detection pipeline’s PSD update period of approximately 67 </w:t>
-      </w:r>
-      <w:proofErr w:type="spellStart"/>
-      <w:r>
-        <w:t>ms.</w:t>
-      </w:r>
-      <w:proofErr w:type="spellEnd"/>
+        <w:t>All command packets follow the SPS-500 manufacturer’s protocol, consisting of header bytes, a command identifier, a data payload, and a CRC-8 checksum for data integrity verification. Commands transmitted to the SPS-500 include velocity set commands (azimuth and elevation axes independently), position query commands (to retrieve current encoder angles referenced to 0° = true north for azimuth and 0° = horizontal for elevation), and system status requests. Measured command round-trip latency is less than 5 ms at 115200 bps, which is negligible relative to the detection pipeline’s PSD update period of approximately 67 ms.</w:t>
+      </w:r>
     </w:p>
     <w:p>
       <w:pPr>
@@ -7161,55 +5263,7 @@
         <w:spacing w:after="120" w:line="276" w:lineRule="auto"/>
       </w:pPr>
       <w:r>
-        <w:t>This is where the RF side and the mechanical side come together. When the system is in TRACK mode, it runs a hill-climbing loop on the Yagi channel: measure RSSI at the current position, nudge the antenna by a small step (</w:t>
-      </w:r>
-      <w:proofErr w:type="spellStart"/>
-      <w:r>
-        <w:t>Δθ</w:t>
-      </w:r>
-      <w:proofErr w:type="spellEnd"/>
-      <w:r>
-        <w:t xml:space="preserve"> = 2.0°), measure again, and compute the gradient ΔR/</w:t>
-      </w:r>
-      <w:proofErr w:type="spellStart"/>
-      <w:r>
-        <w:t>Δθ</w:t>
-      </w:r>
-      <w:proofErr w:type="spellEnd"/>
-      <w:r>
-        <w:t xml:space="preserve"> in dB/deg. That gradient gets turned into a velocity command: V = </w:t>
-      </w:r>
-      <w:proofErr w:type="spellStart"/>
-      <w:r>
-        <w:t>K_p</w:t>
-      </w:r>
-      <w:proofErr w:type="spellEnd"/>
-      <w:r>
-        <w:t xml:space="preserve"> × ΔR/</w:t>
-      </w:r>
-      <w:proofErr w:type="spellStart"/>
-      <w:r>
-        <w:t>Δθ</w:t>
-      </w:r>
-      <w:proofErr w:type="spellEnd"/>
-      <w:r>
-        <w:t xml:space="preserve">, with </w:t>
-      </w:r>
-      <w:proofErr w:type="spellStart"/>
-      <w:r>
-        <w:t>K_p</w:t>
-      </w:r>
-      <w:proofErr w:type="spellEnd"/>
-      <w:r>
-        <w:t xml:space="preserve"> = 0.5 deg/s per dB/deg (found through trial and error). We cap velocity at 10.0 deg/</w:t>
-      </w:r>
-      <w:proofErr w:type="gramStart"/>
-      <w:r>
-        <w:t>s</w:t>
-      </w:r>
-      <w:proofErr w:type="gramEnd"/>
-      <w:r>
-        <w:t xml:space="preserve"> so the positioner does not overshoot and lose the signal.</w:t>
+        <w:t>This is where the RF side and the mechanical side come together. When the system is in TRACK mode, it runs a hill-climbing loop on the Yagi channel: measure RSSI at the current position, nudge the antenna by a small step (Δθ = 2.0°), measure again, and compute the gradient ΔR/Δθ in dB/deg. That gradient gets turned into a velocity command: V = K_p × ΔR/Δθ, with K_p = 0.5 deg/s per dB/deg (found through trial and error). We cap velocity at 10.0 deg/s so the positioner does not overshoot and lose the signal.</w:t>
       </w:r>
     </w:p>
     <w:p>
@@ -7217,29 +5271,7 @@
         <w:spacing w:after="120" w:line="276" w:lineRule="auto"/>
       </w:pPr>
       <w:r>
-        <w:t xml:space="preserve">RSSI is computed from 1024 IQ samples as RSSI (dBm) = 10 × log₁₀[(1/N) × </w:t>
-      </w:r>
-      <w:proofErr w:type="gramStart"/>
-      <w:r>
-        <w:t>Σ(</w:t>
-      </w:r>
-      <w:proofErr w:type="gramEnd"/>
-      <w:r>
-        <w:t>I² + Q²)] + calibration offset. At 30.72 MSPS that’s about 33 µs of integration, which is enough to average out noise spikes but still fast enough to react to antenna movement. The algorithm considers itself converged when RSSI stays within 1.0 dB for five consecutive cycles, at which point it slows down and just checks periodically in case the target moves. One thing we want to add later is adaptive step sizing</w:t>
-      </w:r>
-      <w:r>
-        <w:t xml:space="preserve">, </w:t>
-      </w:r>
-      <w:r>
-        <w:t xml:space="preserve">right now the 2° step is fixed, but ideally it would shrink as we get close to the </w:t>
-      </w:r>
-      <w:proofErr w:type="gramStart"/>
-      <w:r>
-        <w:t>peak</w:t>
-      </w:r>
-      <w:proofErr w:type="gramEnd"/>
-      <w:r>
-        <w:t xml:space="preserve"> so we don’t keep overshooting back and forth.</w:t>
+        <w:t>RSSI is computed from 1024 IQ samples as RSSI (dBm) = 10 × log₁₀[(1/N) × Σ(I² + Q²)] + calibration offset. At 30.72 MSPS that’s about 33 µs of integration, which is enough to average out noise spikes but still fast enough to react to antenna movement. The algorithm considers itself converged when RSSI stays within 1.0 dB for five consecutive cycles, at which point it slows down and just checks periodically in case the target moves. One thing we want to add later is adaptive step sizing, right now the 2° step is fixed, but ideally it would shrink as we get close to the peak so we don’t keep overshooting back and forth.</w:t>
       </w:r>
     </w:p>
     <w:p>
@@ -7257,15 +5289,7 @@
         <w:spacing w:after="120" w:line="276" w:lineRule="auto"/>
       </w:pPr>
       <w:r>
-        <w:t xml:space="preserve">We ran a full link budget to check whether 200 yards is realistic. For a DJI </w:t>
-      </w:r>
-      <w:proofErr w:type="spellStart"/>
-      <w:r>
-        <w:t>OcuSync</w:t>
-      </w:r>
-      <w:proofErr w:type="spellEnd"/>
-      <w:r>
-        <w:t xml:space="preserve"> drone transmitting at +23 dBm EIRP at 183 meters range:</w:t>
+        <w:t>We ran a full link budget to check whether 200 yards is realistic. For a DJI OcuSync drone transmitting at +23 dBm EIRP at 183 meters range:</w:t>
       </w:r>
     </w:p>
     <w:p>
@@ -7407,27 +5431,7 @@
           <w:sz w:val="20"/>
           <w:szCs w:val="20"/>
         </w:rPr>
-        <w:t xml:space="preserve">Figure 6: Link budget analysis diagram for DJI </w:t>
-      </w:r>
-      <w:proofErr w:type="spellStart"/>
-      <w:r>
-        <w:rPr>
-          <w:i/>
-          <w:iCs/>
-          <w:sz w:val="20"/>
-          <w:szCs w:val="20"/>
-        </w:rPr>
-        <w:t>OcuSync</w:t>
-      </w:r>
-      <w:proofErr w:type="spellEnd"/>
-      <w:r>
-        <w:rPr>
-          <w:i/>
-          <w:iCs/>
-          <w:sz w:val="20"/>
-          <w:szCs w:val="20"/>
-        </w:rPr>
-        <w:t xml:space="preserve"> at 200 yards. The system achieves &gt;47 dB margin.</w:t>
+        <w:t>Figure 6: Link budget analysis diagram for DJI OcuSync at 200 yards. The system achieves &gt;47 dB margin.</w:t>
       </w:r>
     </w:p>
     <w:p>
@@ -7435,15 +5439,7 @@
         <w:spacing w:after="120" w:line="276" w:lineRule="auto"/>
       </w:pPr>
       <w:r>
-        <w:t xml:space="preserve">This substantial margin confirms that 200 yards is well within the system’s capability, with a theoretical free-space maximum range of several kilometers. Practical performance in the field will be limited by multipath, clutter from co-channel </w:t>
-      </w:r>
-      <w:proofErr w:type="spellStart"/>
-      <w:r>
-        <w:t>WiFi</w:t>
-      </w:r>
-      <w:proofErr w:type="spellEnd"/>
-      <w:r>
-        <w:t xml:space="preserve"> transmitters, and non-ideal propagation conditions.</w:t>
+        <w:t>This substantial margin confirms that 200 yards is well within the system’s capability, with a theoretical free-space maximum range of several kilometers. Practical performance in the field will be limited by multipath, clutter from co-channel WiFi transmitters, and non-ideal propagation conditions.</w:t>
       </w:r>
     </w:p>
     <w:p>
@@ -7461,55 +5457,7 @@
         <w:spacing w:after="120" w:line="276" w:lineRule="auto"/>
       </w:pPr>
       <w:r>
-        <w:t xml:space="preserve">The software is organized into five Python packages: </w:t>
-      </w:r>
-      <w:proofErr w:type="spellStart"/>
-      <w:r>
-        <w:t>sdr</w:t>
-      </w:r>
-      <w:proofErr w:type="spellEnd"/>
-      <w:r>
-        <w:t xml:space="preserve"> (capture and configuration), dsp (spectrum analysis and detection), antenna (controller and state machine), pipeline (async engine wiring all components), and </w:t>
-      </w:r>
-      <w:proofErr w:type="spellStart"/>
-      <w:r>
-        <w:t>ui</w:t>
-      </w:r>
-      <w:proofErr w:type="spellEnd"/>
-      <w:r>
-        <w:t xml:space="preserve"> (real-time visualization). All hardware parameters are externalized to a YAML configuration file with zero hardcoded values. Configuration is loaded into frozen (immutable) </w:t>
-      </w:r>
-      <w:proofErr w:type="spellStart"/>
-      <w:r>
-        <w:t>dataclasses</w:t>
-      </w:r>
-      <w:proofErr w:type="spellEnd"/>
-      <w:r>
-        <w:t xml:space="preserve"> at startup, preventing runtime mutation of critical parameters. The async pipeline engine uses Python’s </w:t>
-      </w:r>
-      <w:proofErr w:type="spellStart"/>
-      <w:r>
-        <w:t>asyncio</w:t>
-      </w:r>
-      <w:proofErr w:type="spellEnd"/>
-      <w:r>
-        <w:t xml:space="preserve"> for non-blocking I/O, wrapping USRP hardware reads in </w:t>
-      </w:r>
-      <w:proofErr w:type="spellStart"/>
-      <w:r>
-        <w:t>asyncio.to_</w:t>
-      </w:r>
-      <w:proofErr w:type="gramStart"/>
-      <w:r>
-        <w:t>thread</w:t>
-      </w:r>
-      <w:proofErr w:type="spellEnd"/>
-      <w:r>
-        <w:t>(</w:t>
-      </w:r>
-      <w:proofErr w:type="gramEnd"/>
-      <w:r>
-        <w:t>) to avoid blocking the main event loop.</w:t>
+        <w:t>The software is organized into five Python packages: sdr (capture and configuration), dsp (spectrum analysis and detection), antenna (controller and state machine), pipeline (async engine wiring all components), and ui (real-time visualization). All hardware parameters are externalized to a YAML configuration file with zero hardcoded values. Configuration is loaded into frozen (immutable) dataclasses at startup, preventing runtime mutation of critical parameters. The async pipeline engine uses Python’s asyncio for non-blocking I/O, wrapping USRP hardware reads in asyncio.to_thread() to avoid blocking the main event loop.</w:t>
       </w:r>
     </w:p>
     <w:p>
@@ -7877,23 +5825,7 @@
                 <w:sz w:val="20"/>
                 <w:szCs w:val="20"/>
               </w:rPr>
-              <w:t xml:space="preserve">12 </w:t>
-            </w:r>
-            <w:proofErr w:type="spellStart"/>
-            <w:r>
-              <w:rPr>
-                <w:sz w:val="20"/>
-                <w:szCs w:val="20"/>
-              </w:rPr>
-              <w:t>dBi</w:t>
-            </w:r>
-            <w:proofErr w:type="spellEnd"/>
-            <w:r>
-              <w:rPr>
-                <w:sz w:val="20"/>
-                <w:szCs w:val="20"/>
-              </w:rPr>
-              <w:t>, 35° BW</w:t>
+              <w:t>12 dBi, 35° BW</w:t>
             </w:r>
           </w:p>
         </w:tc>
@@ -8006,23 +5938,7 @@
                 <w:sz w:val="20"/>
                 <w:szCs w:val="20"/>
               </w:rPr>
-              <w:t xml:space="preserve">2 </w:t>
-            </w:r>
-            <w:proofErr w:type="spellStart"/>
-            <w:r>
-              <w:rPr>
-                <w:sz w:val="20"/>
-                <w:szCs w:val="20"/>
-              </w:rPr>
-              <w:t>dBi</w:t>
-            </w:r>
-            <w:proofErr w:type="spellEnd"/>
-            <w:r>
-              <w:rPr>
-                <w:sz w:val="20"/>
-                <w:szCs w:val="20"/>
-              </w:rPr>
-              <w:t>, 360°</w:t>
+              <w:t>2 dBi, 360°</w:t>
             </w:r>
           </w:p>
         </w:tc>
@@ -8250,23 +6166,7 @@
                 <w:sz w:val="20"/>
                 <w:szCs w:val="20"/>
               </w:rPr>
-              <w:t xml:space="preserve">0.01° res, 360° </w:t>
-            </w:r>
-            <w:proofErr w:type="spellStart"/>
-            <w:r>
-              <w:rPr>
-                <w:sz w:val="20"/>
-                <w:szCs w:val="20"/>
-              </w:rPr>
-              <w:t>az</w:t>
-            </w:r>
-            <w:proofErr w:type="spellEnd"/>
-            <w:r>
-              <w:rPr>
-                <w:sz w:val="20"/>
-                <w:szCs w:val="20"/>
-              </w:rPr>
-              <w:t>, RS-422</w:t>
+              <w:t>0.01° res, 360° az, RS-422</w:t>
             </w:r>
           </w:p>
         </w:tc>
@@ -8479,23 +6379,7 @@
         <w:spacing w:after="120" w:line="276" w:lineRule="auto"/>
       </w:pPr>
       <w:r>
-        <w:t xml:space="preserve">The unit test suite contains over 60 test cases organized across seven test modules covering configuration loading, synthetic IQ source validation, PSD computation, both detector algorithms, antenna controller state machine, and full pipeline integration. All tests operate on synthetic IQ data generated by the </w:t>
-      </w:r>
-      <w:proofErr w:type="spellStart"/>
-      <w:r>
-        <w:t>SyntheticSource</w:t>
-      </w:r>
-      <w:proofErr w:type="spellEnd"/>
-      <w:r>
-        <w:t xml:space="preserve"> class, which produces deterministic, </w:t>
-      </w:r>
-      <w:proofErr w:type="spellStart"/>
-      <w:r>
-        <w:t>seedable</w:t>
-      </w:r>
-      <w:proofErr w:type="spellEnd"/>
-      <w:r>
-        <w:t xml:space="preserve"> complex64 signals including pure tones, wideband OFDM-like signals, and calibrated Gaussian noise.</w:t>
+        <w:t>The unit test suite contains over 60 test cases organized across seven test modules covering configuration loading, synthetic IQ source validation, PSD computation, both detector algorithms, antenna controller state machine, and full pipeline integration. All tests operate on synthetic IQ data generated by the SyntheticSource class, which produces deterministic, seedable complex64 signals including pure tones, wideband OFDM-like signals, and calibrated Gaussian noise.</w:t>
       </w:r>
     </w:p>
     <w:tbl>
@@ -8761,23 +6645,7 @@
                 <w:sz w:val="20"/>
                 <w:szCs w:val="20"/>
               </w:rPr>
-              <w:t xml:space="preserve">Source </w:t>
-            </w:r>
-            <w:proofErr w:type="spellStart"/>
-            <w:r>
-              <w:rPr>
-                <w:sz w:val="20"/>
-                <w:szCs w:val="20"/>
-              </w:rPr>
-              <w:t>dtype</w:t>
-            </w:r>
-            <w:proofErr w:type="spellEnd"/>
-            <w:r>
-              <w:rPr>
-                <w:sz w:val="20"/>
-                <w:szCs w:val="20"/>
-              </w:rPr>
-              <w:t>, shape, noise power, tone detection</w:t>
+              <w:t>Source dtype, shape, noise power, tone detection</w:t>
             </w:r>
           </w:p>
         </w:tc>
@@ -8864,23 +6732,7 @@
                 <w:sz w:val="20"/>
                 <w:szCs w:val="20"/>
               </w:rPr>
-              <w:t xml:space="preserve">PSD shape, </w:t>
-            </w:r>
-            <w:proofErr w:type="spellStart"/>
-            <w:r>
-              <w:rPr>
-                <w:sz w:val="20"/>
-                <w:szCs w:val="20"/>
-              </w:rPr>
-              <w:t>freq</w:t>
-            </w:r>
-            <w:proofErr w:type="spellEnd"/>
-            <w:r>
-              <w:rPr>
-                <w:sz w:val="20"/>
-                <w:szCs w:val="20"/>
-              </w:rPr>
-              <w:t xml:space="preserve"> range, tone recovery (±3 dB)</w:t>
+              <w:t>PSD shape, freq range, tone recovery (±3 dB)</w:t>
             </w:r>
           </w:p>
         </w:tc>
@@ -9292,15 +7144,7 @@
         <w:spacing w:after="120" w:line="276" w:lineRule="auto"/>
       </w:pPr>
       <w:r>
-        <w:t xml:space="preserve">Table 6 presents the quantitative performance targets and </w:t>
-      </w:r>
-      <w:proofErr w:type="gramStart"/>
-      <w:r>
-        <w:t>current status</w:t>
-      </w:r>
-      <w:proofErr w:type="gramEnd"/>
-      <w:r>
-        <w:t xml:space="preserve"> for each metric.</w:t>
+        <w:t>Table 6 presents the quantitative performance targets and current status for each metric.</w:t>
       </w:r>
     </w:p>
     <w:tbl>
@@ -9878,23 +7722,7 @@
                 <w:sz w:val="20"/>
                 <w:szCs w:val="20"/>
               </w:rPr>
-              <w:t xml:space="preserve">~67 </w:t>
-            </w:r>
-            <w:proofErr w:type="spellStart"/>
-            <w:r>
-              <w:rPr>
-                <w:sz w:val="20"/>
-                <w:szCs w:val="20"/>
-              </w:rPr>
-              <w:t>ms</w:t>
-            </w:r>
-            <w:proofErr w:type="spellEnd"/>
-            <w:r>
-              <w:rPr>
-                <w:sz w:val="20"/>
-                <w:szCs w:val="20"/>
-              </w:rPr>
-              <w:t xml:space="preserve"> per frame</w:t>
+              <w:t>~67 ms per frame</w:t>
             </w:r>
           </w:p>
         </w:tc>
@@ -9939,27 +7767,7 @@
           <w:sz w:val="20"/>
           <w:szCs w:val="20"/>
         </w:rPr>
-        <w:t xml:space="preserve">Table 6: Performance targets and </w:t>
-      </w:r>
-      <w:proofErr w:type="gramStart"/>
-      <w:r>
-        <w:rPr>
-          <w:i/>
-          <w:iCs/>
-          <w:sz w:val="20"/>
-          <w:szCs w:val="20"/>
-        </w:rPr>
-        <w:t>current status</w:t>
-      </w:r>
-      <w:proofErr w:type="gramEnd"/>
-      <w:r>
-        <w:rPr>
-          <w:i/>
-          <w:iCs/>
-          <w:sz w:val="20"/>
-          <w:szCs w:val="20"/>
-        </w:rPr>
-        <w:t>.</w:t>
+        <w:t>Table 6: Performance targets and current status.</w:t>
       </w:r>
     </w:p>
     <w:p>
@@ -10080,15 +7888,7 @@
         <w:spacing w:after="60" w:line="276" w:lineRule="auto"/>
       </w:pPr>
       <w:r>
-        <w:t xml:space="preserve">ASTM F3411-22a: Standard Specification for Remote ID and Tracking. The system’s </w:t>
-      </w:r>
-      <w:proofErr w:type="spellStart"/>
-      <w:r>
-        <w:t>RemoteID</w:t>
-      </w:r>
-      <w:proofErr w:type="spellEnd"/>
-      <w:r>
-        <w:t xml:space="preserve"> decoder implements this standard for parsing drone identity and position broadcasts.</w:t>
+        <w:t>ASTM F3411-22a: Standard Specification for Remote ID and Tracking. The system’s RemoteID decoder implements this standard for parsing drone identity and position broadcasts.</w:t>
       </w:r>
     </w:p>
     <w:p>
@@ -10101,15 +7901,7 @@
         <w:spacing w:after="60" w:line="276" w:lineRule="auto"/>
       </w:pPr>
       <w:r>
-        <w:t xml:space="preserve">IEEE 802.11: </w:t>
-      </w:r>
-      <w:proofErr w:type="spellStart"/>
-      <w:r>
-        <w:t>WiFi</w:t>
-      </w:r>
-      <w:proofErr w:type="spellEnd"/>
-      <w:r>
-        <w:t xml:space="preserve"> protocol standard. The system captures and parses 802.11 beacon frames for drone identification via MAC OUI matching.</w:t>
+        <w:t>IEEE 802.11: WiFi protocol standard. The system captures and parses 802.11 beacon frames for drone identification via MAC OUI matching.</w:t>
       </w:r>
     </w:p>
     <w:p>
@@ -10134,21 +7926,8 @@
         </w:numPr>
         <w:spacing w:after="60" w:line="276" w:lineRule="auto"/>
       </w:pPr>
-      <w:proofErr w:type="spellStart"/>
-      <w:r>
-        <w:t>SigMF</w:t>
-      </w:r>
-      <w:proofErr w:type="spellEnd"/>
-      <w:r>
-        <w:t xml:space="preserve"> (Signal Metadata Format): Raw IQ captures are stored with </w:t>
-      </w:r>
-      <w:proofErr w:type="spellStart"/>
-      <w:r>
-        <w:t>SigMF</w:t>
-      </w:r>
-      <w:proofErr w:type="spellEnd"/>
-      <w:r>
-        <w:t>-compliant metadata sidecar files for interoperability with other SDR tools.</w:t>
+      <w:r>
+        <w:t>SigMF (Signal Metadata Format): Raw IQ captures are stored with SigMF-compliant metadata sidecar files for interoperability with other SDR tools.</w:t>
       </w:r>
     </w:p>
     <w:p>
@@ -10202,15 +7981,7 @@
         <w:spacing w:after="120" w:line="276" w:lineRule="auto"/>
       </w:pPr>
       <w:r>
-        <w:t xml:space="preserve">We tried to keep the UI simple enough that you do not need to be an RF engineer to use it. The main display is a PPI-style radar view with color-coded detections, and it updates automatically. All the tunable parameters live in one YAML config file with comments explaining what each one does. You start the whole system with “make run-live” and it scans on its own from there. Eventually we want to add a web-based config </w:t>
-      </w:r>
-      <w:proofErr w:type="gramStart"/>
-      <w:r>
-        <w:t>page</w:t>
-      </w:r>
-      <w:proofErr w:type="gramEnd"/>
-      <w:r>
-        <w:t xml:space="preserve"> so operators never have to touch the command line, but that’s future work.</w:t>
+        <w:t>We tried to keep the UI simple enough that you do not need to be an RF engineer to use it. The main display is a PPI-style radar view with color-coded detections, and it updates automatically. All the tunable parameters live in one YAML config file with comments explaining what each one does. You start the whole system with “make run-live” and it scans on its own from there. Eventually we want to add a web-based config page so operators never have to touch the command line, but that’s future work.</w:t>
       </w:r>
     </w:p>
     <w:p>
@@ -11132,7 +8903,6 @@
             </w:tcMar>
           </w:tcPr>
           <w:p>
-            <w:proofErr w:type="spellStart"/>
             <w:r>
               <w:rPr>
                 <w:sz w:val="20"/>
@@ -11140,7 +8910,6 @@
               </w:rPr>
               <w:t>Misc</w:t>
             </w:r>
-            <w:proofErr w:type="spellEnd"/>
           </w:p>
         </w:tc>
         <w:tc>
@@ -11240,7 +9009,6 @@
             </w:tcMar>
           </w:tcPr>
           <w:p>
-            <w:proofErr w:type="spellStart"/>
             <w:r>
               <w:rPr>
                 <w:sz w:val="20"/>
@@ -11248,7 +9016,6 @@
               </w:rPr>
               <w:t>Misc</w:t>
             </w:r>
-            <w:proofErr w:type="spellEnd"/>
           </w:p>
         </w:tc>
         <w:tc>
@@ -11437,21 +9204,7 @@
         <w:spacing w:after="120" w:line="276" w:lineRule="auto"/>
       </w:pPr>
       <w:r>
-        <w:t>The project is split across two semesters with a mid-May 2026 deadline. Fall 2025 was all research and design validation</w:t>
-      </w:r>
-      <w:r>
-        <w:t xml:space="preserve">, </w:t>
-      </w:r>
-      <w:r>
-        <w:t xml:space="preserve">nothing was </w:t>
-      </w:r>
-      <w:proofErr w:type="gramStart"/>
-      <w:r>
-        <w:t>actually built</w:t>
-      </w:r>
-      <w:proofErr w:type="gramEnd"/>
-      <w:r>
-        <w:t>. Starting in January 2026 we began writing the software and bringing up the RF chain. We just received the Honeywell positioning hardware in mid-March, so motion control integration is happening now. The remaining schedule has field tuning and bearing estimation through April, followed by bench and field testing in late April into early May.</w:t>
+        <w:t>The project is split across two semesters with a mid-May 2026 deadline. Fall 2025 was all research and design validation, nothing was actually built. Starting in January 2026 we began writing the software and bringing up the RF chain. We just received the Honeywell positioning hardware in mid-March, so motion control integration is happening now. The remaining schedule has field tuning and bearing estimation through April, followed by bench and field testing in late April into early May.</w:t>
       </w:r>
     </w:p>
     <w:p>
@@ -11539,21 +9292,7 @@
         <w:spacing w:after="120" w:line="276" w:lineRule="auto"/>
       </w:pPr>
       <w:r>
-        <w:t xml:space="preserve">On the societal side, the main benefit of a passive system is that it is cheap enough and license-free enough to </w:t>
-      </w:r>
-      <w:proofErr w:type="gramStart"/>
-      <w:r>
-        <w:t>actually get</w:t>
-      </w:r>
-      <w:proofErr w:type="gramEnd"/>
-      <w:r>
-        <w:t xml:space="preserve"> deployed. Active radar counter-drone systems cost tens of thousands of dollars and need FCC approval to transmit</w:t>
-      </w:r>
-      <w:r>
-        <w:t xml:space="preserve">, </w:t>
-      </w:r>
-      <w:r>
-        <w:t>that puts them out of reach for most security teams. A receive-only system like ours could realistically be set up at a school, a stadium, or a small airport without any of that overhead.</w:t>
+        <w:t>On the societal side, the main benefit of a passive system is that it is cheap enough and license-free enough to actually get deployed. Active radar counter-drone systems cost tens of thousands of dollars and need FCC approval to transmit, that puts them out of reach for most security teams. A receive-only system like ours could realistically be set up at a school, a stadium, or a small airport without any of that overhead.</w:t>
       </w:r>
     </w:p>
     <w:p>
@@ -11569,13 +9308,7 @@
         <w:spacing w:after="120" w:line="276" w:lineRule="auto"/>
       </w:pPr>
       <w:r>
-        <w:t>The ethical angle we thought about the most is privacy. Our system is pointed at drones, not people, but Remote ID broadcasts include the operator’s GPS position, so there is inherently some location tracking going on. We think this is acceptable because Remote ID is an FAA mandate</w:t>
-      </w:r>
-      <w:r>
-        <w:t xml:space="preserve">, </w:t>
-      </w:r>
-      <w:r>
-        <w:t>those beacons are designed to be publicly readable by anyone, and we are not intercepting any private or encrypted communications. That said, anyone deploying a system like this should obviously check local and federal regulations around RF monitoring before using it operationally.</w:t>
+        <w:t>The ethical angle we thought about the most is privacy. Our system is pointed at drones, not people, but Remote ID broadcasts include the operator’s GPS position, so there is inherently some location tracking going on. We think this is acceptable because Remote ID is an FAA mandate, those beacons are designed to be publicly readable by anyone, and we are not intercepting any private or encrypted communications. That said, anyone deploying a system like this should obviously check local and federal regulations around RF monitoring before using it operationally.</w:t>
       </w:r>
     </w:p>
     <w:p>
@@ -11612,23 +9345,7 @@
         <w:spacing w:after="60" w:line="276" w:lineRule="auto"/>
       </w:pPr>
       <w:r>
-        <w:t xml:space="preserve">The dual-channel SDR architecture using the USRP B210 has been successfully implemented, with both the </w:t>
-      </w:r>
-      <w:proofErr w:type="spellStart"/>
-      <w:r>
-        <w:t>SyntheticSource</w:t>
-      </w:r>
-      <w:proofErr w:type="spellEnd"/>
-      <w:r>
-        <w:t xml:space="preserve"> (for testing) and </w:t>
-      </w:r>
-      <w:proofErr w:type="spellStart"/>
-      <w:r>
-        <w:t>USRPSource</w:t>
-      </w:r>
-      <w:proofErr w:type="spellEnd"/>
-      <w:r>
-        <w:t xml:space="preserve"> (for hardware) operational.</w:t>
+        <w:t>The dual-channel SDR architecture using the USRP B210 has been successfully implemented, with both the SyntheticSource (for testing) and USRPSource (for hardware) operational.</w:t>
       </w:r>
     </w:p>
     <w:p>
@@ -11641,19 +9358,7 @@
         <w:spacing w:after="60" w:line="276" w:lineRule="auto"/>
       </w:pPr>
       <w:r>
-        <w:t>The signal processing pipeline</w:t>
-      </w:r>
-      <w:r>
-        <w:t xml:space="preserve">, </w:t>
-      </w:r>
-      <w:r>
-        <w:t>including DC offset removal, Welch PSD estimation, adaptive tripwire detection, and CA-CFAR detection</w:t>
-      </w:r>
-      <w:r>
-        <w:t xml:space="preserve">, </w:t>
-      </w:r>
-      <w:r>
-        <w:t>is fully functional and validated against synthetic IQ data.</w:t>
+        <w:t>The signal processing pipeline, including DC offset removal, Welch PSD estimation, adaptive tripwire detection, and CA-CFAR detection, is fully functional and validated against synthetic IQ data.</w:t>
       </w:r>
     </w:p>
     <w:p>
@@ -11666,15 +9371,7 @@
         <w:spacing w:after="60" w:line="276" w:lineRule="auto"/>
       </w:pPr>
       <w:r>
-        <w:t xml:space="preserve">Link budget analysis confirms a detection margin exceeding 47 dB for DJI </w:t>
-      </w:r>
-      <w:proofErr w:type="spellStart"/>
-      <w:r>
-        <w:t>OcuSync</w:t>
-      </w:r>
-      <w:proofErr w:type="spellEnd"/>
-      <w:r>
-        <w:t xml:space="preserve"> signals at the 200-yard target range, demonstrating that the design is not sensitivity-limited for the intended application.</w:t>
+        <w:t>Link budget analysis confirms a detection margin exceeding 47 dB for DJI OcuSync signals at the 200-yard target range, demonstrating that the design is not sensitivity-limited for the intended application.</w:t>
       </w:r>
     </w:p>
     <w:p>
@@ -11687,15 +9384,7 @@
         <w:spacing w:after="60" w:line="276" w:lineRule="auto"/>
       </w:pPr>
       <w:r>
-        <w:t xml:space="preserve">The antenna control state machine (SCAN, CUE, TRACK) has been implemented and tested in simulation, with the </w:t>
-      </w:r>
-      <w:proofErr w:type="spellStart"/>
-      <w:r>
-        <w:t>SimulatedController</w:t>
-      </w:r>
-      <w:proofErr w:type="spellEnd"/>
-      <w:r>
-        <w:t xml:space="preserve"> accurately modeling slew rates and state transitions.</w:t>
+        <w:t>The antenna control state machine (SCAN, CUE, TRACK) has been implemented and tested in simulation, with the SimulatedController accurately modeling slew rates and state transitions.</w:t>
       </w:r>
     </w:p>
     <w:p>
@@ -11729,23 +9418,7 @@
         <w:spacing w:after="120" w:line="276" w:lineRule="auto"/>
       </w:pPr>
       <w:r>
-        <w:t xml:space="preserve">What is left: finish the </w:t>
-      </w:r>
-      <w:proofErr w:type="spellStart"/>
-      <w:r>
-        <w:t>RemoteID</w:t>
-      </w:r>
-      <w:proofErr w:type="spellEnd"/>
-      <w:r>
-        <w:t xml:space="preserve"> and DJI </w:t>
-      </w:r>
-      <w:proofErr w:type="spellStart"/>
-      <w:r>
-        <w:t>DroneID</w:t>
-      </w:r>
-      <w:proofErr w:type="spellEnd"/>
-      <w:r>
-        <w:t xml:space="preserve"> decoders, get the radar frontend talking to the pipeline over WebSocket, integrate the SPS-500 motion control, and then move into bench testing and field validation with actual drones. The schedule is tight with a mid-May delivery, but the hardest design work is behind us and the remaining tasks are mostly integration and testing.</w:t>
+        <w:t>What is left: finish the RemoteID and DJI DroneID decoders, get the radar frontend talking to the pipeline over WebSocket, integrate the SPS-500 motion control, and then move into bench testing and field validation with actual drones. The schedule is tight with a mid-May delivery, but the hardest design work is behind us and the remaining tasks are mostly integration and testing.</w:t>
       </w:r>
     </w:p>
     <w:p>
@@ -11774,23 +9447,7 @@
           <w:sz w:val="20"/>
           <w:szCs w:val="20"/>
         </w:rPr>
-        <w:t xml:space="preserve">[1] Schiller, N., et al., "Drone Security and the Mysterious Case of DJI’s </w:t>
-      </w:r>
-      <w:proofErr w:type="spellStart"/>
-      <w:r>
-        <w:rPr>
-          <w:sz w:val="20"/>
-          <w:szCs w:val="20"/>
-        </w:rPr>
-        <w:t>DroneID</w:t>
-      </w:r>
-      <w:proofErr w:type="spellEnd"/>
-      <w:r>
-        <w:rPr>
-          <w:sz w:val="20"/>
-          <w:szCs w:val="20"/>
-        </w:rPr>
-        <w:t>," Proc. NDSS Symposium, 2023.</w:t>
+        <w:t>[1] Schiller, N., et al., "Drone Security and the Mysterious Case of DJI’s DroneID," Proc. NDSS Symposium, 2023.</w:t>
       </w:r>
     </w:p>
     <w:p>
@@ -11816,68 +9473,20 @@
           <w:sz w:val="20"/>
           <w:szCs w:val="20"/>
         </w:rPr>
-        <w:t>[3] Nguyen, P., et al., "</w:t>
-      </w:r>
-      <w:proofErr w:type="spellStart"/>
+        <w:t>[3] Nguyen, P., et al., "Matthan: Drone Presence Detection by Identifying Physical Signatures in the Drone’s RF Communication," Proc. ACM MobiSys, 2017.</w:t>
+      </w:r>
+    </w:p>
+    <w:p>
+      <w:pPr>
+        <w:spacing w:after="80" w:line="276" w:lineRule="auto"/>
+        <w:ind w:left="720" w:hanging="720"/>
+      </w:pPr>
       <w:r>
         <w:rPr>
           <w:sz w:val="20"/>
           <w:szCs w:val="20"/>
         </w:rPr>
-        <w:t>Matthan</w:t>
-      </w:r>
-      <w:proofErr w:type="spellEnd"/>
-      <w:r>
-        <w:rPr>
-          <w:sz w:val="20"/>
-          <w:szCs w:val="20"/>
-        </w:rPr>
-        <w:t xml:space="preserve">: Drone Presence Detection by Identifying Physical Signatures in the Drone’s RF Communication," Proc. ACM </w:t>
-      </w:r>
-      <w:proofErr w:type="spellStart"/>
-      <w:r>
-        <w:rPr>
-          <w:sz w:val="20"/>
-          <w:szCs w:val="20"/>
-        </w:rPr>
-        <w:t>MobiSys</w:t>
-      </w:r>
-      <w:proofErr w:type="spellEnd"/>
-      <w:r>
-        <w:rPr>
-          <w:sz w:val="20"/>
-          <w:szCs w:val="20"/>
-        </w:rPr>
-        <w:t>, 2017.</w:t>
-      </w:r>
-    </w:p>
-    <w:p>
-      <w:pPr>
-        <w:spacing w:after="80" w:line="276" w:lineRule="auto"/>
-        <w:ind w:left="720" w:hanging="720"/>
-      </w:pPr>
-      <w:r>
-        <w:rPr>
-          <w:sz w:val="20"/>
-          <w:szCs w:val="20"/>
-        </w:rPr>
-        <w:t xml:space="preserve">[4] </w:t>
-      </w:r>
-      <w:proofErr w:type="spellStart"/>
-      <w:r>
-        <w:rPr>
-          <w:sz w:val="20"/>
-          <w:szCs w:val="20"/>
-        </w:rPr>
-        <w:t>Ezuma</w:t>
-      </w:r>
-      <w:proofErr w:type="spellEnd"/>
-      <w:r>
-        <w:rPr>
-          <w:sz w:val="20"/>
-          <w:szCs w:val="20"/>
-        </w:rPr>
-        <w:t>, M., et al., "Detection and Classification of UAVs Using RF Fingerprints in the Presence of Wi-Fi and Bluetooth Interference," IEEE Access, vol. 8, 2020.</w:t>
+        <w:t>[4] Ezuma, M., et al., "Detection and Classification of UAVs Using RF Fingerprints in the Presence of Wi-Fi and Bluetooth Interference," IEEE Access, vol. 8, 2020.</w:t>
       </w:r>
     </w:p>
     <w:p>
@@ -11916,136 +9525,33 @@
           <w:sz w:val="20"/>
           <w:szCs w:val="20"/>
         </w:rPr>
-        <w:t>[7] Open Drone ID Project, "</w:t>
-      </w:r>
-      <w:proofErr w:type="spellStart"/>
+        <w:t>[7] Open Drone ID Project, "opendroneid-core-c," https://github.com/opendroneid/opendroneid-core-c</w:t>
+      </w:r>
+    </w:p>
+    <w:p>
+      <w:pPr>
+        <w:spacing w:after="80" w:line="276" w:lineRule="auto"/>
+        <w:ind w:left="720" w:hanging="720"/>
+      </w:pPr>
       <w:r>
         <w:rPr>
           <w:sz w:val="20"/>
           <w:szCs w:val="20"/>
         </w:rPr>
-        <w:t>opendroneid</w:t>
-      </w:r>
-      <w:proofErr w:type="spellEnd"/>
+        <w:t>[8] proto17, "DJI DroneID MATLAB Decoder," https://github.com/proto17/dji_droneid</w:t>
+      </w:r>
+    </w:p>
+    <w:p>
+      <w:pPr>
+        <w:spacing w:after="80" w:line="276" w:lineRule="auto"/>
+        <w:ind w:left="720" w:hanging="720"/>
+      </w:pPr>
       <w:r>
         <w:rPr>
           <w:sz w:val="20"/>
           <w:szCs w:val="20"/>
         </w:rPr>
-        <w:t>-core-c," https://github.com/opendroneid/opendroneid-core-c</w:t>
-      </w:r>
-    </w:p>
-    <w:p>
-      <w:pPr>
-        <w:spacing w:after="80" w:line="276" w:lineRule="auto"/>
-        <w:ind w:left="720" w:hanging="720"/>
-      </w:pPr>
-      <w:r>
-        <w:rPr>
-          <w:sz w:val="20"/>
-          <w:szCs w:val="20"/>
-        </w:rPr>
-        <w:t xml:space="preserve">[8] proto17, "DJI </w:t>
-      </w:r>
-      <w:proofErr w:type="spellStart"/>
-      <w:r>
-        <w:rPr>
-          <w:sz w:val="20"/>
-          <w:szCs w:val="20"/>
-        </w:rPr>
-        <w:t>DroneID</w:t>
-      </w:r>
-      <w:proofErr w:type="spellEnd"/>
-      <w:r>
-        <w:rPr>
-          <w:sz w:val="20"/>
-          <w:szCs w:val="20"/>
-        </w:rPr>
-        <w:t xml:space="preserve"> MATLAB Decoder," https://github.com/proto17/dji_droneid</w:t>
-      </w:r>
-    </w:p>
-    <w:p>
-      <w:pPr>
-        <w:spacing w:after="80" w:line="276" w:lineRule="auto"/>
-        <w:ind w:left="720" w:hanging="720"/>
-      </w:pPr>
-      <w:r>
-        <w:rPr>
-          <w:sz w:val="20"/>
-          <w:szCs w:val="20"/>
-        </w:rPr>
-        <w:t>[9] RUB-</w:t>
-      </w:r>
-      <w:proofErr w:type="spellStart"/>
-      <w:r>
-        <w:rPr>
-          <w:sz w:val="20"/>
-          <w:szCs w:val="20"/>
-        </w:rPr>
-        <w:t>SysSec</w:t>
-      </w:r>
-      <w:proofErr w:type="spellEnd"/>
-      <w:r>
-        <w:rPr>
-          <w:sz w:val="20"/>
-          <w:szCs w:val="20"/>
-        </w:rPr>
-        <w:t>, "</w:t>
-      </w:r>
-      <w:proofErr w:type="spellStart"/>
-      <w:proofErr w:type="gramStart"/>
-      <w:r>
-        <w:rPr>
-          <w:sz w:val="20"/>
-          <w:szCs w:val="20"/>
-        </w:rPr>
-        <w:t>DroneSecurity</w:t>
-      </w:r>
-      <w:proofErr w:type="spellEnd"/>
-      <w:r>
-        <w:rPr>
-          <w:sz w:val="20"/>
-          <w:szCs w:val="20"/>
-        </w:rPr>
-        <w:t xml:space="preserve"> </w:t>
-      </w:r>
-      <w:r>
-        <w:rPr>
-          <w:sz w:val="20"/>
-          <w:szCs w:val="20"/>
-        </w:rPr>
-        <w:t>,</w:t>
-      </w:r>
-      <w:proofErr w:type="gramEnd"/>
-      <w:r>
-        <w:rPr>
-          <w:sz w:val="20"/>
-          <w:szCs w:val="20"/>
-        </w:rPr>
-        <w:t xml:space="preserve"> </w:t>
-      </w:r>
-      <w:r>
-        <w:rPr>
-          <w:sz w:val="20"/>
-          <w:szCs w:val="20"/>
-        </w:rPr>
-        <w:t xml:space="preserve"> DJI </w:t>
-      </w:r>
-      <w:proofErr w:type="spellStart"/>
-      <w:r>
-        <w:rPr>
-          <w:sz w:val="20"/>
-          <w:szCs w:val="20"/>
-        </w:rPr>
-        <w:t>DroneID</w:t>
-      </w:r>
-      <w:proofErr w:type="spellEnd"/>
-      <w:r>
-        <w:rPr>
-          <w:sz w:val="20"/>
-          <w:szCs w:val="20"/>
-        </w:rPr>
-        <w:t xml:space="preserve"> SDR Receiver," https://github.com/RUB-SysSec/DroneSecurity</w:t>
+        <w:t>[9] RUB-SysSec, "DroneSecurity ,  DJI DroneID SDR Receiver," https://github.com/RUB-SysSec/DroneSecurity</w:t>
       </w:r>
     </w:p>
     <w:p>
@@ -12071,75 +9577,20 @@
           <w:sz w:val="20"/>
           <w:szCs w:val="20"/>
         </w:rPr>
-        <w:t xml:space="preserve">[11] L-com, "HG2415Y-RSP 15 </w:t>
-      </w:r>
-      <w:proofErr w:type="spellStart"/>
+        <w:t>[11] L-com, "HG2415Y-RSP 15 dBi 2.4 GHz Yagi Antenna Datasheet."</w:t>
+      </w:r>
+    </w:p>
+    <w:p>
+      <w:pPr>
+        <w:spacing w:after="80" w:line="276" w:lineRule="auto"/>
+        <w:ind w:left="720" w:hanging="720"/>
+      </w:pPr>
       <w:r>
         <w:rPr>
           <w:sz w:val="20"/>
           <w:szCs w:val="20"/>
         </w:rPr>
-        <w:t>dBi</w:t>
-      </w:r>
-      <w:proofErr w:type="spellEnd"/>
-      <w:r>
-        <w:rPr>
-          <w:sz w:val="20"/>
-          <w:szCs w:val="20"/>
-        </w:rPr>
-        <w:t xml:space="preserve"> 2.4 GHz Yagi Antenna Datasheet."</w:t>
-      </w:r>
-    </w:p>
-    <w:p>
-      <w:pPr>
-        <w:spacing w:after="80" w:line="276" w:lineRule="auto"/>
-        <w:ind w:left="720" w:hanging="720"/>
-      </w:pPr>
-      <w:r>
-        <w:rPr>
-          <w:sz w:val="20"/>
-          <w:szCs w:val="20"/>
-        </w:rPr>
-        <w:t>[12] GNU Radio Foundation, "</w:t>
-      </w:r>
-      <w:proofErr w:type="spellStart"/>
-      <w:proofErr w:type="gramStart"/>
-      <w:r>
-        <w:rPr>
-          <w:sz w:val="20"/>
-          <w:szCs w:val="20"/>
-        </w:rPr>
-        <w:t>SigMF</w:t>
-      </w:r>
-      <w:proofErr w:type="spellEnd"/>
-      <w:r>
-        <w:rPr>
-          <w:sz w:val="20"/>
-          <w:szCs w:val="20"/>
-        </w:rPr>
-        <w:t xml:space="preserve"> </w:t>
-      </w:r>
-      <w:r>
-        <w:rPr>
-          <w:sz w:val="20"/>
-          <w:szCs w:val="20"/>
-        </w:rPr>
-        <w:t>,</w:t>
-      </w:r>
-      <w:proofErr w:type="gramEnd"/>
-      <w:r>
-        <w:rPr>
-          <w:sz w:val="20"/>
-          <w:szCs w:val="20"/>
-        </w:rPr>
-        <w:t xml:space="preserve"> </w:t>
-      </w:r>
-      <w:r>
-        <w:rPr>
-          <w:sz w:val="20"/>
-          <w:szCs w:val="20"/>
-        </w:rPr>
-        <w:t xml:space="preserve"> Signal Metadata Format Specification," https://github.com/gnuradio/SigMF</w:t>
+        <w:t>[12] GNU Radio Foundation, "SigMF ,  Signal Metadata Format Specification," https://github.com/gnuradio/SigMF</w:t>
       </w:r>
     </w:p>
     <w:p>
@@ -12323,17 +9774,7 @@
       </w:pPr>
       <w:bookmarkStart w:id="49" w:name="_Toc224758626"/>
       <w:r>
-        <w:t>Appendix C: Configuration File (</w:t>
-      </w:r>
-      <w:proofErr w:type="spellStart"/>
-      <w:proofErr w:type="gramStart"/>
-      <w:r>
-        <w:t>config.yaml</w:t>
-      </w:r>
-      <w:proofErr w:type="spellEnd"/>
-      <w:proofErr w:type="gramEnd"/>
-      <w:r>
-        <w:t>)</w:t>
+        <w:t>Appendix C: Configuration File (config.yaml)</w:t>
       </w:r>
       <w:bookmarkEnd w:id="49"/>
     </w:p>
@@ -12342,17 +9783,7 @@
         <w:spacing w:after="120" w:line="276" w:lineRule="auto"/>
       </w:pPr>
       <w:r>
-        <w:t xml:space="preserve">The complete system configuration file is maintained in the project repository at </w:t>
-      </w:r>
-      <w:proofErr w:type="spellStart"/>
-      <w:proofErr w:type="gramStart"/>
-      <w:r>
-        <w:t>config.yaml</w:t>
-      </w:r>
-      <w:proofErr w:type="spellEnd"/>
-      <w:proofErr w:type="gramEnd"/>
-      <w:r>
-        <w:t>. It defines all SDR parameters, DSP settings, antenna specifications, scan modes, and detection thresholds. No values are hardcoded in the source code. See the project repository for the current version.</w:t>
+        <w:t>The complete system configuration file is maintained in the project repository at config.yaml. It defines all SDR parameters, DSP settings, antenna specifications, scan modes, and detection thresholds. No values are hardcoded in the source code. See the project repository for the current version.</w:t>
       </w:r>
     </w:p>
     <w:p>
@@ -12370,25 +9801,7 @@
         <w:spacing w:after="120" w:line="276" w:lineRule="auto"/>
       </w:pPr>
       <w:r>
-        <w:t>Mermaid-format source files for all system diagrams are provided in the diagrams/</w:t>
-      </w:r>
-      <w:proofErr w:type="spellStart"/>
-      <w:r>
-        <w:t>mermaid_src</w:t>
-      </w:r>
-      <w:proofErr w:type="spellEnd"/>
-      <w:r>
-        <w:t>/ directory. These can be rendered using the Mermaid CLI (mmdc), the Mermaid Live Editor (</w:t>
-      </w:r>
-      <w:proofErr w:type="spellStart"/>
-      <w:proofErr w:type="gramStart"/>
-      <w:r>
-        <w:t>mermaid.live</w:t>
-      </w:r>
-      <w:proofErr w:type="spellEnd"/>
-      <w:proofErr w:type="gramEnd"/>
-      <w:r>
-        <w:t>), or any Mermaid-compatible tool. Source files included:</w:t>
+        <w:t>Mermaid-format source files for all system diagrams are provided in the diagrams/mermaid_src/ directory. These can be rendered using the Mermaid CLI (mmdc), the Mermaid Live Editor (mermaid.live), or any Mermaid-compatible tool. Source files included:</w:t>
       </w:r>
     </w:p>
     <w:p>
@@ -12402,21 +9815,7 @@
       </w:pPr>
       <w:r>
         <w:lastRenderedPageBreak/>
-        <w:t>fig1_system_</w:t>
-      </w:r>
-      <w:proofErr w:type="gramStart"/>
-      <w:r>
-        <w:t>architecture.mermaid</w:t>
-      </w:r>
-      <w:proofErr w:type="gramEnd"/>
-      <w:r>
-        <w:t xml:space="preserve"> </w:t>
-      </w:r>
-      <w:r>
-        <w:t xml:space="preserve">, </w:t>
-      </w:r>
-      <w:r>
-        <w:t xml:space="preserve"> Full hardware/software block diagram</w:t>
+        <w:t>fig1_system_architecture.mermaid ,  Full hardware/software block diagram</w:t>
       </w:r>
     </w:p>
     <w:p>
@@ -12429,21 +9828,7 @@
         <w:spacing w:after="60" w:line="276" w:lineRule="auto"/>
       </w:pPr>
       <w:r>
-        <w:t>fig2_dsp_</w:t>
-      </w:r>
-      <w:proofErr w:type="gramStart"/>
-      <w:r>
-        <w:t>pipeline.mermaid</w:t>
-      </w:r>
-      <w:proofErr w:type="gramEnd"/>
-      <w:r>
-        <w:t xml:space="preserve"> </w:t>
-      </w:r>
-      <w:r>
-        <w:t xml:space="preserve">, </w:t>
-      </w:r>
-      <w:r>
-        <w:t xml:space="preserve"> Signal processing flow</w:t>
+        <w:t>fig2_dsp_pipeline.mermaid ,  Signal processing flow</w:t>
       </w:r>
     </w:p>
     <w:p>
@@ -12456,21 +9841,7 @@
         <w:spacing w:after="60" w:line="276" w:lineRule="auto"/>
       </w:pPr>
       <w:r>
-        <w:t>fig3_antenna_state_</w:t>
-      </w:r>
-      <w:proofErr w:type="gramStart"/>
-      <w:r>
-        <w:t>machine.mermaid</w:t>
-      </w:r>
-      <w:proofErr w:type="gramEnd"/>
-      <w:r>
-        <w:t xml:space="preserve"> </w:t>
-      </w:r>
-      <w:r>
-        <w:t xml:space="preserve">, </w:t>
-      </w:r>
-      <w:r>
-        <w:t xml:space="preserve"> IDLE/SCAN/CUE/TRACK state diagram</w:t>
+        <w:t>fig3_antenna_state_machine.mermaid ,  IDLE/SCAN/CUE/TRACK state diagram</w:t>
       </w:r>
     </w:p>
     <w:p>
@@ -12483,21 +9854,7 @@
         <w:spacing w:after="60" w:line="276" w:lineRule="auto"/>
       </w:pPr>
       <w:r>
-        <w:t>fig4_function_</w:t>
-      </w:r>
-      <w:proofErr w:type="gramStart"/>
-      <w:r>
-        <w:t>decomposition.mermaid</w:t>
-      </w:r>
-      <w:proofErr w:type="gramEnd"/>
-      <w:r>
-        <w:t xml:space="preserve"> </w:t>
-      </w:r>
-      <w:r>
-        <w:t xml:space="preserve">, </w:t>
-      </w:r>
-      <w:r>
-        <w:t xml:space="preserve"> System function tree</w:t>
+        <w:t>fig4_function_decomposition.mermaid ,  System function tree</w:t>
       </w:r>
     </w:p>
     <w:p>
@@ -12510,21 +9867,7 @@
         <w:spacing w:after="60" w:line="276" w:lineRule="auto"/>
       </w:pPr>
       <w:r>
-        <w:t>fig7_gantt_</w:t>
-      </w:r>
-      <w:proofErr w:type="gramStart"/>
-      <w:r>
-        <w:t>chart.mermaid</w:t>
-      </w:r>
-      <w:proofErr w:type="gramEnd"/>
-      <w:r>
-        <w:t xml:space="preserve"> </w:t>
-      </w:r>
-      <w:r>
-        <w:t xml:space="preserve">, </w:t>
-      </w:r>
-      <w:r>
-        <w:t xml:space="preserve"> Project timeline Gantt chart</w:t>
+        <w:t>fig7_gantt_chart.mermaid ,  Project timeline Gantt chart</w:t>
       </w:r>
     </w:p>
     <w:p>
@@ -12554,19 +9897,8 @@
         </w:numPr>
         <w:spacing w:after="60" w:line="276" w:lineRule="auto"/>
       </w:pPr>
-      <w:proofErr w:type="gramStart"/>
-      <w:r>
-        <w:t xml:space="preserve">USRP_B210_datasheet.md </w:t>
-      </w:r>
-      <w:r>
-        <w:t>,</w:t>
-      </w:r>
-      <w:proofErr w:type="gramEnd"/>
-      <w:r>
-        <w:t xml:space="preserve"> </w:t>
-      </w:r>
-      <w:r>
-        <w:t xml:space="preserve"> Ettus Research USRP B210 specifications</w:t>
+      <w:r>
+        <w:t>USRP_B210_datasheet.md ,  Ettus Research USRP B210 specifications</w:t>
       </w:r>
     </w:p>
     <w:p>
@@ -12578,27 +9910,8 @@
         </w:numPr>
         <w:spacing w:after="60" w:line="276" w:lineRule="auto"/>
       </w:pPr>
-      <w:proofErr w:type="gramStart"/>
-      <w:r>
-        <w:t xml:space="preserve">L-com_HG2415Y-RSP_datasheet.md </w:t>
-      </w:r>
-      <w:r>
-        <w:t>,</w:t>
-      </w:r>
-      <w:proofErr w:type="gramEnd"/>
-      <w:r>
-        <w:t xml:space="preserve"> </w:t>
-      </w:r>
-      <w:r>
-        <w:t xml:space="preserve"> L-com 15 </w:t>
-      </w:r>
-      <w:proofErr w:type="spellStart"/>
-      <w:r>
-        <w:t>dBi</w:t>
-      </w:r>
-      <w:proofErr w:type="spellEnd"/>
-      <w:r>
-        <w:t xml:space="preserve"> Yagi antenna</w:t>
+      <w:r>
+        <w:t>L-com_HG2415Y-RSP_datasheet.md ,  L-com 15 dBi Yagi antenna</w:t>
       </w:r>
     </w:p>
     <w:p>
@@ -12610,19 +9923,8 @@
         </w:numPr>
         <w:spacing w:after="60" w:line="276" w:lineRule="auto"/>
       </w:pPr>
-      <w:proofErr w:type="gramStart"/>
-      <w:r>
-        <w:t xml:space="preserve">PCB_Yagi_B0BWM9X2HJ_datasheet.md </w:t>
-      </w:r>
-      <w:r>
-        <w:t>,</w:t>
-      </w:r>
-      <w:proofErr w:type="gramEnd"/>
-      <w:r>
-        <w:t xml:space="preserve"> </w:t>
-      </w:r>
-      <w:r>
-        <w:t xml:space="preserve"> PCB Yagi test antenna</w:t>
+      <w:r>
+        <w:t>PCB_Yagi_B0BWM9X2HJ_datasheet.md ,  PCB Yagi test antenna</w:t>
       </w:r>
     </w:p>
     <w:p>
@@ -12634,19 +9936,8 @@
         </w:numPr>
         <w:spacing w:after="60" w:line="276" w:lineRule="auto"/>
       </w:pPr>
-      <w:proofErr w:type="gramStart"/>
-      <w:r>
-        <w:t xml:space="preserve">BPF_2401_datasheet.md </w:t>
-      </w:r>
-      <w:r>
-        <w:t>,</w:t>
-      </w:r>
-      <w:proofErr w:type="gramEnd"/>
-      <w:r>
-        <w:t xml:space="preserve"> </w:t>
-      </w:r>
-      <w:r>
-        <w:t xml:space="preserve"> 2.4 GHz bandpass filter</w:t>
+      <w:r>
+        <w:t>BPF_2401_datasheet.md ,  2.4 GHz bandpass filter</w:t>
       </w:r>
     </w:p>
     <w:sectPr>
@@ -12881,30 +10172,8 @@
         <w:sz w:val="18"/>
         <w:szCs w:val="18"/>
       </w:rPr>
-      <w:t xml:space="preserve">Passive RF Drone Detection </w:t>
+      <w:t>Passive RF Drone Detection System</w:t>
     </w:r>
-    <w:proofErr w:type="gramStart"/>
-    <w:r>
-      <w:rPr>
-        <w:i/>
-        <w:iCs/>
-        <w:color w:val="888888"/>
-        <w:sz w:val="18"/>
-        <w:szCs w:val="18"/>
-      </w:rPr>
-      <w:t xml:space="preserve">System </w:t>
-    </w:r>
-    <w:r>
-      <w:rPr>
-        <w:i/>
-        <w:iCs/>
-        <w:color w:val="888888"/>
-        <w:sz w:val="18"/>
-        <w:szCs w:val="18"/>
-      </w:rPr>
-      <w:t>,</w:t>
-    </w:r>
-    <w:proofErr w:type="gramEnd"/>
     <w:r>
       <w:rPr>
         <w:i/>
@@ -12923,7 +10192,7 @@
         <w:sz w:val="18"/>
         <w:szCs w:val="18"/>
       </w:rPr>
-      <w:t xml:space="preserve"> Progress Report</w:t>
+      <w:t>Progress Report</w:t>
     </w:r>
   </w:p>
 </w:hdr>
@@ -13834,6 +11103,48 @@
       <w:ind w:left="440"/>
     </w:pPr>
   </w:style>
+  <w:style w:type="paragraph" w:styleId="Header">
+    <w:name w:val="header"/>
+    <w:basedOn w:val="Normal"/>
+    <w:link w:val="HeaderChar"/>
+    <w:uiPriority w:val="99"/>
+    <w:unhideWhenUsed/>
+    <w:rsid w:val="00403795"/>
+    <w:pPr>
+      <w:tabs>
+        <w:tab w:val="center" w:pos="4680"/>
+        <w:tab w:val="right" w:pos="9360"/>
+      </w:tabs>
+    </w:pPr>
+  </w:style>
+  <w:style w:type="character" w:customStyle="1" w:styleId="HeaderChar">
+    <w:name w:val="Header Char"/>
+    <w:basedOn w:val="DefaultParagraphFont"/>
+    <w:link w:val="Header"/>
+    <w:uiPriority w:val="99"/>
+    <w:rsid w:val="00403795"/>
+  </w:style>
+  <w:style w:type="paragraph" w:styleId="Footer">
+    <w:name w:val="footer"/>
+    <w:basedOn w:val="Normal"/>
+    <w:link w:val="FooterChar"/>
+    <w:uiPriority w:val="99"/>
+    <w:unhideWhenUsed/>
+    <w:rsid w:val="00403795"/>
+    <w:pPr>
+      <w:tabs>
+        <w:tab w:val="center" w:pos="4680"/>
+        <w:tab w:val="right" w:pos="9360"/>
+      </w:tabs>
+    </w:pPr>
+  </w:style>
+  <w:style w:type="character" w:customStyle="1" w:styleId="FooterChar">
+    <w:name w:val="Footer Char"/>
+    <w:basedOn w:val="DefaultParagraphFont"/>
+    <w:link w:val="Footer"/>
+    <w:uiPriority w:val="99"/>
+    <w:rsid w:val="00403795"/>
+  </w:style>
 </w:styles>
 </file>
 

</xml_diff>